<commit_message>
added in details documentation to the word file
</commit_message>
<xml_diff>
--- a/AddressBookProjectFlowAndExplanation.docx
+++ b/AddressBookProjectFlowAndExplanation.docx
@@ -55,23 +55,7 @@
           <w:sz w:val="24"/>
           <w:szCs w:val="22"/>
         </w:rPr>
-        <w:t xml:space="preserve">In this project we have a struct of contact in which we are having name, </w:t>
-      </w:r>
-      <w:r>
-        <w:rPr>
-          <w:rFonts w:ascii="Times New Roman" w:hAnsi="Times New Roman" w:cs="Times New Roman"/>
-          <w:sz w:val="24"/>
-          <w:szCs w:val="22"/>
-        </w:rPr>
-        <w:t>phone,</w:t>
-      </w:r>
-      <w:r>
-        <w:rPr>
-          <w:rFonts w:ascii="Times New Roman" w:hAnsi="Times New Roman" w:cs="Times New Roman"/>
-          <w:sz w:val="24"/>
-          <w:szCs w:val="22"/>
-        </w:rPr>
-        <w:t xml:space="preserve"> and email.</w:t>
+        <w:t>In this project we have a struct of contact in which we are having name, phone, and email.</w:t>
       </w:r>
       <w:r>
         <w:rPr>
@@ -198,23 +182,7 @@
           <w:sz w:val="24"/>
           <w:szCs w:val="22"/>
         </w:rPr>
-        <w:t xml:space="preserve">deleting contact, searching </w:t>
-      </w:r>
-      <w:r>
-        <w:rPr>
-          <w:rFonts w:ascii="Times New Roman" w:hAnsi="Times New Roman" w:cs="Times New Roman"/>
-          <w:sz w:val="24"/>
-          <w:szCs w:val="22"/>
-        </w:rPr>
-        <w:t>contact,</w:t>
-      </w:r>
-      <w:r>
-        <w:rPr>
-          <w:rFonts w:ascii="Times New Roman" w:hAnsi="Times New Roman" w:cs="Times New Roman"/>
-          <w:sz w:val="24"/>
-          <w:szCs w:val="22"/>
-        </w:rPr>
-        <w:t xml:space="preserve"> and listing contact will be performed on this array.</w:t>
+        <w:t>deleting contact, searching contact, and listing contact will be performed on this array.</w:t>
       </w:r>
       <w:r>
         <w:rPr>
@@ -309,23 +277,7 @@
           <w:sz w:val="24"/>
           <w:szCs w:val="22"/>
         </w:rPr>
-        <w:t xml:space="preserve">the matched contacts and ir_size </w:t>
-      </w:r>
-      <w:r>
-        <w:rPr>
-          <w:rFonts w:ascii="Times New Roman" w:hAnsi="Times New Roman" w:cs="Times New Roman"/>
-          <w:sz w:val="24"/>
-          <w:szCs w:val="22"/>
-        </w:rPr>
-        <w:t>keep</w:t>
-      </w:r>
-      <w:r>
-        <w:rPr>
-          <w:rFonts w:ascii="Times New Roman" w:hAnsi="Times New Roman" w:cs="Times New Roman"/>
-          <w:sz w:val="24"/>
-          <w:szCs w:val="22"/>
-        </w:rPr>
-        <w:t xml:space="preserve"> track of how many matches are found. This is useful when</w:t>
+        <w:t>the matched contacts and ir_size keep track of how many matches are found. This is useful when</w:t>
       </w:r>
     </w:p>
     <w:p>
@@ -569,15 +521,718 @@
           <w:sz w:val="24"/>
           <w:szCs w:val="22"/>
         </w:rPr>
-        <w:t xml:space="preserve">is found then the contact is added to the </w:t>
-      </w:r>
-      <w:r>
-        <w:rPr>
-          <w:rFonts w:ascii="Times New Roman" w:hAnsi="Times New Roman" w:cs="Times New Roman"/>
-          <w:sz w:val="24"/>
-          <w:szCs w:val="22"/>
-        </w:rPr>
-        <w:t>contact’s</w:t>
+        <w:t>is found then the contact is added to the contact’s array.</w:t>
+      </w:r>
+    </w:p>
+    <w:p>
+      <w:pPr>
+        <w:spacing w:line="276" w:lineRule="auto"/>
+        <w:rPr>
+          <w:rFonts w:ascii="Times New Roman" w:hAnsi="Times New Roman" w:cs="Times New Roman"/>
+          <w:sz w:val="24"/>
+          <w:szCs w:val="22"/>
+        </w:rPr>
+      </w:pPr>
+    </w:p>
+    <w:p>
+      <w:pPr>
+        <w:spacing w:line="276" w:lineRule="auto"/>
+        <w:rPr>
+          <w:rFonts w:ascii="Times New Roman" w:hAnsi="Times New Roman" w:cs="Times New Roman"/>
+          <w:sz w:val="24"/>
+          <w:szCs w:val="22"/>
+        </w:rPr>
+      </w:pPr>
+      <w:r>
+        <w:rPr>
+          <w:rFonts w:ascii="Times New Roman" w:hAnsi="Times New Roman" w:cs="Times New Roman"/>
+          <w:sz w:val="24"/>
+          <w:szCs w:val="22"/>
+        </w:rPr>
+        <w:t>2) search_contact:</w:t>
+      </w:r>
+    </w:p>
+    <w:p>
+      <w:pPr>
+        <w:spacing w:line="276" w:lineRule="auto"/>
+        <w:rPr>
+          <w:rFonts w:ascii="Times New Roman" w:hAnsi="Times New Roman" w:cs="Times New Roman"/>
+          <w:sz w:val="24"/>
+          <w:szCs w:val="22"/>
+        </w:rPr>
+      </w:pPr>
+    </w:p>
+    <w:p>
+      <w:pPr>
+        <w:spacing w:line="276" w:lineRule="auto"/>
+        <w:ind w:firstLine="567"/>
+        <w:rPr>
+          <w:rFonts w:ascii="Times New Roman" w:hAnsi="Times New Roman" w:cs="Times New Roman"/>
+          <w:sz w:val="24"/>
+          <w:szCs w:val="22"/>
+        </w:rPr>
+      </w:pPr>
+      <w:r>
+        <w:rPr>
+          <w:rFonts w:ascii="Times New Roman" w:hAnsi="Times New Roman" w:cs="Times New Roman"/>
+          <w:sz w:val="24"/>
+          <w:szCs w:val="22"/>
+        </w:rPr>
+        <w:t xml:space="preserve">In this function we are searching for the contacts using partial name, full phone </w:t>
+      </w:r>
+      <w:r>
+        <w:rPr>
+          <w:rFonts w:ascii="Times New Roman" w:hAnsi="Times New Roman" w:cs="Times New Roman"/>
+          <w:sz w:val="24"/>
+          <w:szCs w:val="22"/>
+        </w:rPr>
+        <w:t>number,</w:t>
+      </w:r>
+      <w:r>
+        <w:rPr>
+          <w:rFonts w:ascii="Times New Roman" w:hAnsi="Times New Roman" w:cs="Times New Roman"/>
+          <w:sz w:val="24"/>
+          <w:szCs w:val="22"/>
+        </w:rPr>
+        <w:t xml:space="preserve"> and</w:t>
+      </w:r>
+      <w:r>
+        <w:rPr>
+          <w:rFonts w:ascii="Times New Roman" w:hAnsi="Times New Roman" w:cs="Times New Roman"/>
+          <w:sz w:val="24"/>
+          <w:szCs w:val="22"/>
+        </w:rPr>
+        <w:t xml:space="preserve"> </w:t>
+      </w:r>
+      <w:r>
+        <w:rPr>
+          <w:rFonts w:ascii="Times New Roman" w:hAnsi="Times New Roman" w:cs="Times New Roman"/>
+          <w:sz w:val="24"/>
+          <w:szCs w:val="22"/>
+        </w:rPr>
+        <w:t>email. For name searching we use partial matching using strstr(), which helps to find contacts</w:t>
+      </w:r>
+      <w:r>
+        <w:rPr>
+          <w:rFonts w:ascii="Times New Roman" w:hAnsi="Times New Roman" w:cs="Times New Roman"/>
+          <w:sz w:val="24"/>
+          <w:szCs w:val="22"/>
+        </w:rPr>
+        <w:t xml:space="preserve"> </w:t>
+      </w:r>
+      <w:r>
+        <w:rPr>
+          <w:rFonts w:ascii="Times New Roman" w:hAnsi="Times New Roman" w:cs="Times New Roman"/>
+          <w:sz w:val="24"/>
+          <w:szCs w:val="22"/>
+        </w:rPr>
+        <w:t>even if only part of the name is entered.</w:t>
+      </w:r>
+      <w:r>
+        <w:rPr>
+          <w:rFonts w:ascii="Times New Roman" w:hAnsi="Times New Roman" w:cs="Times New Roman"/>
+          <w:sz w:val="24"/>
+          <w:szCs w:val="22"/>
+        </w:rPr>
+        <w:t xml:space="preserve"> </w:t>
+      </w:r>
+      <w:r>
+        <w:rPr>
+          <w:rFonts w:ascii="Times New Roman" w:hAnsi="Times New Roman" w:cs="Times New Roman"/>
+          <w:sz w:val="24"/>
+          <w:szCs w:val="22"/>
+        </w:rPr>
+        <w:t>In search contact we are using index_record to store the indices of matched entries. This helps</w:t>
+      </w:r>
+      <w:r>
+        <w:rPr>
+          <w:rFonts w:ascii="Times New Roman" w:hAnsi="Times New Roman" w:cs="Times New Roman"/>
+          <w:sz w:val="24"/>
+          <w:szCs w:val="22"/>
+        </w:rPr>
+        <w:t xml:space="preserve"> </w:t>
+      </w:r>
+      <w:r>
+        <w:rPr>
+          <w:rFonts w:ascii="Times New Roman" w:hAnsi="Times New Roman" w:cs="Times New Roman"/>
+          <w:sz w:val="24"/>
+          <w:szCs w:val="22"/>
+        </w:rPr>
+        <w:t xml:space="preserve">us to display multiple entries properly if duplicate names are present </w:t>
+      </w:r>
+      <w:r>
+        <w:rPr>
+          <w:rFonts w:ascii="Times New Roman" w:hAnsi="Times New Roman" w:cs="Times New Roman"/>
+          <w:sz w:val="24"/>
+          <w:szCs w:val="22"/>
+        </w:rPr>
+        <w:t>and</w:t>
+      </w:r>
+      <w:r>
+        <w:rPr>
+          <w:rFonts w:ascii="Times New Roman" w:hAnsi="Times New Roman" w:cs="Times New Roman"/>
+          <w:sz w:val="24"/>
+          <w:szCs w:val="22"/>
+        </w:rPr>
+        <w:t xml:space="preserve"> helps in future use</w:t>
+      </w:r>
+      <w:r>
+        <w:rPr>
+          <w:rFonts w:ascii="Times New Roman" w:hAnsi="Times New Roman" w:cs="Times New Roman"/>
+          <w:sz w:val="24"/>
+          <w:szCs w:val="22"/>
+        </w:rPr>
+        <w:t xml:space="preserve"> </w:t>
+      </w:r>
+      <w:r>
+        <w:rPr>
+          <w:rFonts w:ascii="Times New Roman" w:hAnsi="Times New Roman" w:cs="Times New Roman"/>
+          <w:sz w:val="24"/>
+          <w:szCs w:val="22"/>
+        </w:rPr>
+        <w:t>of this function in [edit_contact] and [delete_contact].</w:t>
+      </w:r>
+    </w:p>
+    <w:p>
+      <w:pPr>
+        <w:spacing w:line="276" w:lineRule="auto"/>
+        <w:rPr>
+          <w:rFonts w:ascii="Times New Roman" w:hAnsi="Times New Roman" w:cs="Times New Roman"/>
+          <w:sz w:val="24"/>
+          <w:szCs w:val="22"/>
+        </w:rPr>
+      </w:pPr>
+    </w:p>
+    <w:p>
+      <w:pPr>
+        <w:spacing w:line="276" w:lineRule="auto"/>
+        <w:rPr>
+          <w:rFonts w:ascii="Times New Roman" w:hAnsi="Times New Roman" w:cs="Times New Roman"/>
+          <w:sz w:val="24"/>
+          <w:szCs w:val="22"/>
+        </w:rPr>
+      </w:pPr>
+      <w:r>
+        <w:rPr>
+          <w:rFonts w:ascii="Times New Roman" w:hAnsi="Times New Roman" w:cs="Times New Roman"/>
+          <w:sz w:val="24"/>
+          <w:szCs w:val="22"/>
+        </w:rPr>
+        <w:t>All the matched contacts are displayed to the user on the console.</w:t>
+      </w:r>
+    </w:p>
+    <w:p>
+      <w:pPr>
+        <w:spacing w:line="276" w:lineRule="auto"/>
+        <w:rPr>
+          <w:rFonts w:ascii="Times New Roman" w:hAnsi="Times New Roman" w:cs="Times New Roman"/>
+          <w:sz w:val="24"/>
+          <w:szCs w:val="22"/>
+        </w:rPr>
+      </w:pPr>
+    </w:p>
+    <w:p>
+      <w:pPr>
+        <w:spacing w:line="276" w:lineRule="auto"/>
+        <w:rPr>
+          <w:rFonts w:ascii="Times New Roman" w:hAnsi="Times New Roman" w:cs="Times New Roman"/>
+          <w:sz w:val="24"/>
+          <w:szCs w:val="22"/>
+        </w:rPr>
+      </w:pPr>
+    </w:p>
+    <w:p>
+      <w:pPr>
+        <w:spacing w:line="276" w:lineRule="auto"/>
+        <w:rPr>
+          <w:rFonts w:ascii="Times New Roman" w:hAnsi="Times New Roman" w:cs="Times New Roman"/>
+          <w:sz w:val="24"/>
+          <w:szCs w:val="22"/>
+        </w:rPr>
+      </w:pPr>
+    </w:p>
+    <w:p>
+      <w:pPr>
+        <w:spacing w:line="276" w:lineRule="auto"/>
+        <w:rPr>
+          <w:rFonts w:ascii="Times New Roman" w:hAnsi="Times New Roman" w:cs="Times New Roman"/>
+          <w:sz w:val="24"/>
+          <w:szCs w:val="22"/>
+        </w:rPr>
+      </w:pPr>
+    </w:p>
+    <w:p>
+      <w:pPr>
+        <w:spacing w:line="276" w:lineRule="auto"/>
+        <w:rPr>
+          <w:rFonts w:ascii="Times New Roman" w:hAnsi="Times New Roman" w:cs="Times New Roman"/>
+          <w:sz w:val="24"/>
+          <w:szCs w:val="22"/>
+        </w:rPr>
+      </w:pPr>
+    </w:p>
+    <w:p>
+      <w:pPr>
+        <w:spacing w:line="276" w:lineRule="auto"/>
+        <w:rPr>
+          <w:rFonts w:ascii="Times New Roman" w:hAnsi="Times New Roman" w:cs="Times New Roman"/>
+          <w:sz w:val="24"/>
+          <w:szCs w:val="22"/>
+        </w:rPr>
+      </w:pPr>
+      <w:r>
+        <w:rPr>
+          <w:rFonts w:ascii="Times New Roman" w:hAnsi="Times New Roman" w:cs="Times New Roman"/>
+          <w:sz w:val="24"/>
+          <w:szCs w:val="22"/>
+        </w:rPr>
+        <w:t>3) edit_contact:</w:t>
+      </w:r>
+    </w:p>
+    <w:p>
+      <w:pPr>
+        <w:spacing w:line="276" w:lineRule="auto"/>
+        <w:rPr>
+          <w:rFonts w:ascii="Times New Roman" w:hAnsi="Times New Roman" w:cs="Times New Roman"/>
+          <w:sz w:val="24"/>
+          <w:szCs w:val="22"/>
+        </w:rPr>
+      </w:pPr>
+    </w:p>
+    <w:p>
+      <w:pPr>
+        <w:spacing w:line="276" w:lineRule="auto"/>
+        <w:ind w:firstLine="567"/>
+        <w:rPr>
+          <w:rFonts w:ascii="Times New Roman" w:hAnsi="Times New Roman" w:cs="Times New Roman"/>
+          <w:sz w:val="24"/>
+          <w:szCs w:val="22"/>
+        </w:rPr>
+      </w:pPr>
+      <w:r>
+        <w:rPr>
+          <w:rFonts w:ascii="Times New Roman" w:hAnsi="Times New Roman" w:cs="Times New Roman"/>
+          <w:sz w:val="24"/>
+          <w:szCs w:val="22"/>
+        </w:rPr>
+        <w:t>In edit contact we are using the [search_contact] function first, because before editing we</w:t>
+      </w:r>
+      <w:r>
+        <w:rPr>
+          <w:rFonts w:ascii="Times New Roman" w:hAnsi="Times New Roman" w:cs="Times New Roman"/>
+          <w:sz w:val="24"/>
+          <w:szCs w:val="22"/>
+        </w:rPr>
+        <w:t xml:space="preserve"> </w:t>
+      </w:r>
+      <w:r>
+        <w:rPr>
+          <w:rFonts w:ascii="Times New Roman" w:hAnsi="Times New Roman" w:cs="Times New Roman"/>
+          <w:sz w:val="24"/>
+          <w:szCs w:val="22"/>
+        </w:rPr>
+        <w:t>must</w:t>
+      </w:r>
+      <w:r>
+        <w:rPr>
+          <w:rFonts w:ascii="Times New Roman" w:hAnsi="Times New Roman" w:cs="Times New Roman"/>
+          <w:sz w:val="24"/>
+          <w:szCs w:val="22"/>
+        </w:rPr>
+        <w:t xml:space="preserve"> locate the specific contact. After searching, if the contact exists then it will be shown.</w:t>
+      </w:r>
+      <w:r>
+        <w:rPr>
+          <w:rFonts w:ascii="Times New Roman" w:hAnsi="Times New Roman" w:cs="Times New Roman"/>
+          <w:sz w:val="24"/>
+          <w:szCs w:val="22"/>
+        </w:rPr>
+        <w:t xml:space="preserve"> If the contact with the given information is not present then it will show not found message onto the console. </w:t>
+      </w:r>
+      <w:r>
+        <w:rPr>
+          <w:rFonts w:ascii="Times New Roman" w:hAnsi="Times New Roman" w:cs="Times New Roman"/>
+          <w:sz w:val="24"/>
+          <w:szCs w:val="22"/>
+        </w:rPr>
+        <w:t>If multiple entries are found then</w:t>
+      </w:r>
+      <w:r>
+        <w:rPr>
+          <w:rFonts w:ascii="Times New Roman" w:hAnsi="Times New Roman" w:cs="Times New Roman"/>
+          <w:sz w:val="24"/>
+          <w:szCs w:val="22"/>
+        </w:rPr>
+        <w:t>,</w:t>
+      </w:r>
+      <w:r>
+        <w:rPr>
+          <w:rFonts w:ascii="Times New Roman" w:hAnsi="Times New Roman" w:cs="Times New Roman"/>
+          <w:sz w:val="24"/>
+          <w:szCs w:val="22"/>
+        </w:rPr>
+        <w:t xml:space="preserve"> index_record is used to select the correct contact using</w:t>
+      </w:r>
+      <w:r>
+        <w:rPr>
+          <w:rFonts w:ascii="Times New Roman" w:hAnsi="Times New Roman" w:cs="Times New Roman"/>
+          <w:sz w:val="24"/>
+          <w:szCs w:val="22"/>
+        </w:rPr>
+        <w:t xml:space="preserve"> </w:t>
+      </w:r>
+      <w:r>
+        <w:rPr>
+          <w:rFonts w:ascii="Times New Roman" w:hAnsi="Times New Roman" w:cs="Times New Roman"/>
+          <w:sz w:val="24"/>
+          <w:szCs w:val="22"/>
+        </w:rPr>
+        <w:t>user input. After that [inputName], [inputPhone] and [inputEmail] are used again to take new data</w:t>
+      </w:r>
+      <w:r>
+        <w:rPr>
+          <w:rFonts w:ascii="Times New Roman" w:hAnsi="Times New Roman" w:cs="Times New Roman"/>
+          <w:sz w:val="24"/>
+          <w:szCs w:val="22"/>
+        </w:rPr>
+        <w:t xml:space="preserve"> </w:t>
+      </w:r>
+      <w:r>
+        <w:rPr>
+          <w:rFonts w:ascii="Times New Roman" w:hAnsi="Times New Roman" w:cs="Times New Roman"/>
+          <w:sz w:val="24"/>
+          <w:szCs w:val="22"/>
+        </w:rPr>
+        <w:t>with proper validation.</w:t>
+      </w:r>
+    </w:p>
+    <w:p>
+      <w:pPr>
+        <w:spacing w:line="276" w:lineRule="auto"/>
+        <w:rPr>
+          <w:rFonts w:ascii="Times New Roman" w:hAnsi="Times New Roman" w:cs="Times New Roman"/>
+          <w:sz w:val="24"/>
+          <w:szCs w:val="22"/>
+        </w:rPr>
+      </w:pPr>
+    </w:p>
+    <w:p>
+      <w:pPr>
+        <w:spacing w:line="276" w:lineRule="auto"/>
+        <w:ind w:firstLine="567"/>
+        <w:rPr>
+          <w:rFonts w:ascii="Times New Roman" w:hAnsi="Times New Roman" w:cs="Times New Roman"/>
+          <w:sz w:val="24"/>
+          <w:szCs w:val="22"/>
+        </w:rPr>
+      </w:pPr>
+      <w:r>
+        <w:rPr>
+          <w:rFonts w:ascii="Times New Roman" w:hAnsi="Times New Roman" w:cs="Times New Roman"/>
+          <w:sz w:val="24"/>
+          <w:szCs w:val="22"/>
+        </w:rPr>
+        <w:t>While updating the contact we also check that the new phone number and email are duplicates</w:t>
+      </w:r>
+      <w:r>
+        <w:rPr>
+          <w:rFonts w:ascii="Times New Roman" w:hAnsi="Times New Roman" w:cs="Times New Roman"/>
+          <w:sz w:val="24"/>
+          <w:szCs w:val="22"/>
+        </w:rPr>
+        <w:t xml:space="preserve"> </w:t>
+      </w:r>
+      <w:r>
+        <w:rPr>
+          <w:rFonts w:ascii="Times New Roman" w:hAnsi="Times New Roman" w:cs="Times New Roman"/>
+          <w:sz w:val="24"/>
+          <w:szCs w:val="22"/>
+        </w:rPr>
+        <w:t xml:space="preserve">or not </w:t>
+      </w:r>
+      <w:r>
+        <w:rPr>
+          <w:rFonts w:ascii="Times New Roman" w:hAnsi="Times New Roman" w:cs="Times New Roman"/>
+          <w:sz w:val="24"/>
+          <w:szCs w:val="22"/>
+        </w:rPr>
+        <w:t xml:space="preserve">using [ </w:t>
+      </w:r>
+      <w:r>
+        <w:rPr>
+          <w:rFonts w:ascii="Times New Roman" w:hAnsi="Times New Roman" w:cs="Times New Roman"/>
+          <w:sz w:val="24"/>
+          <w:szCs w:val="22"/>
+        </w:rPr>
+        <w:t>searchForDuplicate</w:t>
+      </w:r>
+      <w:r>
+        <w:rPr>
+          <w:rFonts w:ascii="Times New Roman" w:hAnsi="Times New Roman" w:cs="Times New Roman"/>
+          <w:sz w:val="24"/>
+          <w:szCs w:val="22"/>
+        </w:rPr>
+        <w:t xml:space="preserve"> ] </w:t>
+      </w:r>
+      <w:r>
+        <w:rPr>
+          <w:rFonts w:ascii="Times New Roman" w:hAnsi="Times New Roman" w:cs="Times New Roman"/>
+          <w:sz w:val="24"/>
+          <w:szCs w:val="22"/>
+        </w:rPr>
+        <w:t xml:space="preserve">as we </w:t>
+      </w:r>
+      <w:proofErr w:type="gramStart"/>
+      <w:r>
+        <w:rPr>
+          <w:rFonts w:ascii="Times New Roman" w:hAnsi="Times New Roman" w:cs="Times New Roman"/>
+          <w:sz w:val="24"/>
+          <w:szCs w:val="22"/>
+        </w:rPr>
+        <w:t>have to</w:t>
+      </w:r>
+      <w:proofErr w:type="gramEnd"/>
+      <w:r>
+        <w:rPr>
+          <w:rFonts w:ascii="Times New Roman" w:hAnsi="Times New Roman" w:cs="Times New Roman"/>
+          <w:sz w:val="24"/>
+          <w:szCs w:val="22"/>
+        </w:rPr>
+        <w:t xml:space="preserve"> avoid the duplicate entry in database</w:t>
+      </w:r>
+      <w:r>
+        <w:rPr>
+          <w:rFonts w:ascii="Times New Roman" w:hAnsi="Times New Roman" w:cs="Times New Roman"/>
+          <w:sz w:val="24"/>
+          <w:szCs w:val="22"/>
+        </w:rPr>
+        <w:t xml:space="preserve"> (with respect to other contacts</w:t>
+      </w:r>
+      <w:r>
+        <w:rPr>
+          <w:rFonts w:ascii="Times New Roman" w:hAnsi="Times New Roman" w:cs="Times New Roman"/>
+          <w:sz w:val="24"/>
+          <w:szCs w:val="22"/>
+        </w:rPr>
+        <w:t xml:space="preserve"> and not including the current contact which is being edited</w:t>
+      </w:r>
+      <w:r>
+        <w:rPr>
+          <w:rFonts w:ascii="Times New Roman" w:hAnsi="Times New Roman" w:cs="Times New Roman"/>
+          <w:sz w:val="24"/>
+          <w:szCs w:val="22"/>
+        </w:rPr>
+        <w:t>). If everything is valid then the selected contact is updated.</w:t>
+      </w:r>
+    </w:p>
+    <w:p>
+      <w:pPr>
+        <w:spacing w:line="276" w:lineRule="auto"/>
+        <w:rPr>
+          <w:rFonts w:ascii="Times New Roman" w:hAnsi="Times New Roman" w:cs="Times New Roman"/>
+          <w:sz w:val="24"/>
+          <w:szCs w:val="22"/>
+        </w:rPr>
+      </w:pPr>
+    </w:p>
+    <w:p>
+      <w:pPr>
+        <w:spacing w:line="276" w:lineRule="auto"/>
+        <w:rPr>
+          <w:rFonts w:ascii="Times New Roman" w:hAnsi="Times New Roman" w:cs="Times New Roman"/>
+          <w:sz w:val="24"/>
+          <w:szCs w:val="22"/>
+        </w:rPr>
+      </w:pPr>
+      <w:r>
+        <w:rPr>
+          <w:rFonts w:ascii="Times New Roman" w:hAnsi="Times New Roman" w:cs="Times New Roman"/>
+          <w:sz w:val="24"/>
+          <w:szCs w:val="22"/>
+        </w:rPr>
+        <w:t>4) delete_contact:</w:t>
+      </w:r>
+    </w:p>
+    <w:p>
+      <w:pPr>
+        <w:spacing w:line="276" w:lineRule="auto"/>
+        <w:rPr>
+          <w:rFonts w:ascii="Times New Roman" w:hAnsi="Times New Roman" w:cs="Times New Roman"/>
+          <w:sz w:val="24"/>
+          <w:szCs w:val="22"/>
+        </w:rPr>
+      </w:pPr>
+    </w:p>
+    <w:p>
+      <w:pPr>
+        <w:spacing w:line="276" w:lineRule="auto"/>
+        <w:ind w:firstLine="567"/>
+        <w:rPr>
+          <w:rFonts w:ascii="Times New Roman" w:hAnsi="Times New Roman" w:cs="Times New Roman"/>
+          <w:sz w:val="24"/>
+          <w:szCs w:val="22"/>
+        </w:rPr>
+      </w:pPr>
+      <w:r>
+        <w:rPr>
+          <w:rFonts w:ascii="Times New Roman" w:hAnsi="Times New Roman" w:cs="Times New Roman"/>
+          <w:sz w:val="24"/>
+          <w:szCs w:val="22"/>
+        </w:rPr>
+        <w:t>In delete contact we are using the [search_contact] function to find the required contact.</w:t>
+      </w:r>
+      <w:r>
+        <w:rPr>
+          <w:rFonts w:ascii="Times New Roman" w:hAnsi="Times New Roman" w:cs="Times New Roman"/>
+          <w:sz w:val="24"/>
+          <w:szCs w:val="22"/>
+        </w:rPr>
+        <w:t xml:space="preserve"> </w:t>
+      </w:r>
+      <w:r>
+        <w:rPr>
+          <w:rFonts w:ascii="Times New Roman" w:hAnsi="Times New Roman" w:cs="Times New Roman"/>
+          <w:sz w:val="24"/>
+          <w:szCs w:val="22"/>
+        </w:rPr>
+        <w:t>If multiple entries are found then index_record helps to select the correct one.</w:t>
+      </w:r>
+      <w:r>
+        <w:rPr>
+          <w:rFonts w:ascii="Times New Roman" w:hAnsi="Times New Roman" w:cs="Times New Roman"/>
+          <w:sz w:val="24"/>
+          <w:szCs w:val="22"/>
+        </w:rPr>
+        <w:t xml:space="preserve"> </w:t>
+      </w:r>
+      <w:r>
+        <w:rPr>
+          <w:rFonts w:ascii="Times New Roman" w:hAnsi="Times New Roman" w:cs="Times New Roman"/>
+          <w:sz w:val="24"/>
+          <w:szCs w:val="22"/>
+        </w:rPr>
+        <w:t>After selecting the contact, it is deleted from the contacts array by shifting all the</w:t>
+      </w:r>
+      <w:r>
+        <w:rPr>
+          <w:rFonts w:ascii="Times New Roman" w:hAnsi="Times New Roman" w:cs="Times New Roman"/>
+          <w:sz w:val="24"/>
+          <w:szCs w:val="22"/>
+        </w:rPr>
+        <w:t xml:space="preserve"> </w:t>
+      </w:r>
+      <w:r>
+        <w:rPr>
+          <w:rFonts w:ascii="Times New Roman" w:hAnsi="Times New Roman" w:cs="Times New Roman"/>
+          <w:sz w:val="24"/>
+          <w:szCs w:val="22"/>
+        </w:rPr>
+        <w:t>elements one position to the left. Then contactCount is decremented.</w:t>
+      </w:r>
+      <w:r>
+        <w:rPr>
+          <w:rFonts w:ascii="Times New Roman" w:hAnsi="Times New Roman" w:cs="Times New Roman"/>
+          <w:sz w:val="24"/>
+          <w:szCs w:val="22"/>
+        </w:rPr>
+        <w:t xml:space="preserve"> </w:t>
+      </w:r>
+      <w:r>
+        <w:rPr>
+          <w:rFonts w:ascii="Times New Roman" w:hAnsi="Times New Roman" w:cs="Times New Roman"/>
+          <w:sz w:val="24"/>
+          <w:szCs w:val="22"/>
+        </w:rPr>
+        <w:t>Finally, the updated data will be saved to the database while exiting the program using</w:t>
+      </w:r>
+      <w:r>
+        <w:rPr>
+          <w:rFonts w:ascii="Times New Roman" w:hAnsi="Times New Roman" w:cs="Times New Roman"/>
+          <w:sz w:val="24"/>
+          <w:szCs w:val="22"/>
+        </w:rPr>
+        <w:t xml:space="preserve"> </w:t>
+      </w:r>
+      <w:r>
+        <w:rPr>
+          <w:rFonts w:ascii="Times New Roman" w:hAnsi="Times New Roman" w:cs="Times New Roman"/>
+          <w:sz w:val="24"/>
+          <w:szCs w:val="22"/>
+        </w:rPr>
+        <w:t>[saveAllContactsToDataBase].</w:t>
+      </w:r>
+    </w:p>
+    <w:p>
+      <w:pPr>
+        <w:spacing w:line="276" w:lineRule="auto"/>
+        <w:rPr>
+          <w:rFonts w:ascii="Times New Roman" w:hAnsi="Times New Roman" w:cs="Times New Roman"/>
+          <w:sz w:val="24"/>
+          <w:szCs w:val="22"/>
+        </w:rPr>
+      </w:pPr>
+    </w:p>
+    <w:p>
+      <w:pPr>
+        <w:spacing w:line="276" w:lineRule="auto"/>
+        <w:rPr>
+          <w:rFonts w:ascii="Times New Roman" w:hAnsi="Times New Roman" w:cs="Times New Roman"/>
+          <w:sz w:val="24"/>
+          <w:szCs w:val="22"/>
+        </w:rPr>
+      </w:pPr>
+      <w:r>
+        <w:rPr>
+          <w:rFonts w:ascii="Times New Roman" w:hAnsi="Times New Roman" w:cs="Times New Roman"/>
+          <w:sz w:val="24"/>
+          <w:szCs w:val="22"/>
+        </w:rPr>
+        <w:t>5) list_contacts:</w:t>
+      </w:r>
+    </w:p>
+    <w:p>
+      <w:pPr>
+        <w:spacing w:line="276" w:lineRule="auto"/>
+        <w:rPr>
+          <w:rFonts w:ascii="Times New Roman" w:hAnsi="Times New Roman" w:cs="Times New Roman"/>
+          <w:sz w:val="24"/>
+          <w:szCs w:val="22"/>
+        </w:rPr>
+      </w:pPr>
+    </w:p>
+    <w:p>
+      <w:pPr>
+        <w:spacing w:line="276" w:lineRule="auto"/>
+        <w:ind w:firstLine="567"/>
+        <w:rPr>
+          <w:rFonts w:ascii="Times New Roman" w:hAnsi="Times New Roman" w:cs="Times New Roman"/>
+          <w:sz w:val="24"/>
+          <w:szCs w:val="22"/>
+        </w:rPr>
+      </w:pPr>
+      <w:r>
+        <w:rPr>
+          <w:rFonts w:ascii="Times New Roman" w:hAnsi="Times New Roman" w:cs="Times New Roman"/>
+          <w:sz w:val="24"/>
+          <w:szCs w:val="22"/>
+        </w:rPr>
+        <w:t xml:space="preserve">In this function we are printing all the contacts present in the </w:t>
+      </w:r>
+      <w:r>
+        <w:rPr>
+          <w:rFonts w:ascii="Times New Roman" w:hAnsi="Times New Roman" w:cs="Times New Roman"/>
+          <w:sz w:val="24"/>
+          <w:szCs w:val="22"/>
+        </w:rPr>
+        <w:t>contact</w:t>
+      </w:r>
+      <w:r>
+        <w:rPr>
+          <w:rFonts w:ascii="Times New Roman" w:hAnsi="Times New Roman" w:cs="Times New Roman"/>
+          <w:sz w:val="24"/>
+          <w:szCs w:val="22"/>
+        </w:rPr>
+        <w:t>’s</w:t>
       </w:r>
       <w:r>
         <w:rPr>
@@ -587,33 +1242,65 @@
         </w:rPr>
         <w:t xml:space="preserve"> array.</w:t>
       </w:r>
-    </w:p>
-    <w:p>
-      <w:pPr>
-        <w:spacing w:line="276" w:lineRule="auto"/>
-        <w:rPr>
-          <w:rFonts w:ascii="Times New Roman" w:hAnsi="Times New Roman" w:cs="Times New Roman"/>
-          <w:sz w:val="24"/>
-          <w:szCs w:val="22"/>
-        </w:rPr>
-      </w:pPr>
-    </w:p>
-    <w:p>
-      <w:pPr>
-        <w:spacing w:line="276" w:lineRule="auto"/>
-        <w:rPr>
-          <w:rFonts w:ascii="Times New Roman" w:hAnsi="Times New Roman" w:cs="Times New Roman"/>
-          <w:sz w:val="24"/>
-          <w:szCs w:val="22"/>
-        </w:rPr>
-      </w:pPr>
-      <w:r>
-        <w:rPr>
-          <w:rFonts w:ascii="Times New Roman" w:hAnsi="Times New Roman" w:cs="Times New Roman"/>
-          <w:sz w:val="24"/>
-          <w:szCs w:val="22"/>
-        </w:rPr>
-        <w:t>2) search_contact:</w:t>
+      <w:r>
+        <w:rPr>
+          <w:rFonts w:ascii="Times New Roman" w:hAnsi="Times New Roman" w:cs="Times New Roman"/>
+          <w:sz w:val="24"/>
+          <w:szCs w:val="22"/>
+        </w:rPr>
+        <w:t xml:space="preserve"> </w:t>
+      </w:r>
+      <w:r>
+        <w:rPr>
+          <w:rFonts w:ascii="Times New Roman" w:hAnsi="Times New Roman" w:cs="Times New Roman"/>
+          <w:sz w:val="24"/>
+          <w:szCs w:val="22"/>
+        </w:rPr>
+        <w:t>We iterate from 0 to addressBook-&gt;contactCount and print all the details onto the console</w:t>
+      </w:r>
+      <w:r>
+        <w:rPr>
+          <w:rFonts w:ascii="Times New Roman" w:hAnsi="Times New Roman" w:cs="Times New Roman"/>
+          <w:sz w:val="24"/>
+          <w:szCs w:val="22"/>
+        </w:rPr>
+        <w:t xml:space="preserve"> </w:t>
+      </w:r>
+      <w:r>
+        <w:rPr>
+          <w:rFonts w:ascii="Times New Roman" w:hAnsi="Times New Roman" w:cs="Times New Roman"/>
+          <w:sz w:val="24"/>
+          <w:szCs w:val="22"/>
+        </w:rPr>
+        <w:t>in a formatted manner.</w:t>
+      </w:r>
+    </w:p>
+    <w:p>
+      <w:pPr>
+        <w:spacing w:line="276" w:lineRule="auto"/>
+        <w:rPr>
+          <w:rFonts w:ascii="Times New Roman" w:hAnsi="Times New Roman" w:cs="Times New Roman"/>
+          <w:sz w:val="24"/>
+          <w:szCs w:val="22"/>
+        </w:rPr>
+      </w:pPr>
+    </w:p>
+    <w:p>
+      <w:pPr>
+        <w:spacing w:line="276" w:lineRule="auto"/>
+        <w:rPr>
+          <w:rFonts w:ascii="Times New Roman" w:hAnsi="Times New Roman" w:cs="Times New Roman"/>
+          <w:sz w:val="24"/>
+          <w:szCs w:val="22"/>
+        </w:rPr>
+      </w:pPr>
+      <w:r>
+        <w:rPr>
+          <w:rFonts w:ascii="Times New Roman" w:hAnsi="Times New Roman" w:cs="Times New Roman"/>
+          <w:sz w:val="24"/>
+          <w:szCs w:val="22"/>
+        </w:rPr>
+        <w:t>6) Exit:</w:t>
       </w:r>
     </w:p>
     <w:p>
@@ -642,23 +1329,7 @@
           <w:sz w:val="24"/>
           <w:szCs w:val="22"/>
         </w:rPr>
-        <w:t xml:space="preserve">In this function we are searching for the contacts using partial name, full phone </w:t>
-      </w:r>
-      <w:r>
-        <w:rPr>
-          <w:rFonts w:ascii="Times New Roman" w:hAnsi="Times New Roman" w:cs="Times New Roman"/>
-          <w:sz w:val="24"/>
-          <w:szCs w:val="22"/>
-        </w:rPr>
-        <w:t>number,</w:t>
-      </w:r>
-      <w:r>
-        <w:rPr>
-          <w:rFonts w:ascii="Times New Roman" w:hAnsi="Times New Roman" w:cs="Times New Roman"/>
-          <w:sz w:val="24"/>
-          <w:szCs w:val="22"/>
-        </w:rPr>
-        <w:t xml:space="preserve"> and</w:t>
+        <w:t>While exiting the program we are storing all the data present in the contacts array back</w:t>
       </w:r>
       <w:r>
         <w:rPr>
@@ -674,7 +1345,7 @@
           <w:sz w:val="24"/>
           <w:szCs w:val="22"/>
         </w:rPr>
-        <w:t>email. For name searching we use partial matching using strstr(), which helps to find contacts</w:t>
+        <w:t>into the database using [saveAllContactsToDataBase]. This ensures that all changes made during</w:t>
       </w:r>
       <w:r>
         <w:rPr>
@@ -690,204 +1361,512 @@
           <w:sz w:val="24"/>
           <w:szCs w:val="22"/>
         </w:rPr>
-        <w:t>even if only part of the name is entered.</w:t>
-      </w:r>
-      <w:r>
-        <w:rPr>
-          <w:rFonts w:ascii="Times New Roman" w:hAnsi="Times New Roman" w:cs="Times New Roman"/>
-          <w:sz w:val="24"/>
-          <w:szCs w:val="22"/>
-        </w:rPr>
-        <w:t xml:space="preserve"> </w:t>
-      </w:r>
-      <w:r>
-        <w:rPr>
-          <w:rFonts w:ascii="Times New Roman" w:hAnsi="Times New Roman" w:cs="Times New Roman"/>
-          <w:sz w:val="24"/>
-          <w:szCs w:val="22"/>
-        </w:rPr>
-        <w:t>In search contact we are using index_record to store the indices of matched entries. This helps</w:t>
-      </w:r>
-      <w:r>
-        <w:rPr>
-          <w:rFonts w:ascii="Times New Roman" w:hAnsi="Times New Roman" w:cs="Times New Roman"/>
-          <w:sz w:val="24"/>
-          <w:szCs w:val="22"/>
-        </w:rPr>
-        <w:t xml:space="preserve"> </w:t>
-      </w:r>
-      <w:r>
-        <w:rPr>
-          <w:rFonts w:ascii="Times New Roman" w:hAnsi="Times New Roman" w:cs="Times New Roman"/>
-          <w:sz w:val="24"/>
-          <w:szCs w:val="22"/>
-        </w:rPr>
-        <w:t xml:space="preserve">us to display multiple entries properly if duplicate names are present </w:t>
-      </w:r>
-      <w:r>
-        <w:rPr>
-          <w:rFonts w:ascii="Times New Roman" w:hAnsi="Times New Roman" w:cs="Times New Roman"/>
-          <w:sz w:val="24"/>
-          <w:szCs w:val="22"/>
-        </w:rPr>
-        <w:t>and</w:t>
-      </w:r>
-      <w:r>
-        <w:rPr>
-          <w:rFonts w:ascii="Times New Roman" w:hAnsi="Times New Roman" w:cs="Times New Roman"/>
-          <w:sz w:val="24"/>
-          <w:szCs w:val="22"/>
-        </w:rPr>
-        <w:t xml:space="preserve"> helps in future use</w:t>
-      </w:r>
-      <w:r>
-        <w:rPr>
-          <w:rFonts w:ascii="Times New Roman" w:hAnsi="Times New Roman" w:cs="Times New Roman"/>
-          <w:sz w:val="24"/>
-          <w:szCs w:val="22"/>
-        </w:rPr>
-        <w:t xml:space="preserve"> </w:t>
-      </w:r>
-      <w:r>
-        <w:rPr>
-          <w:rFonts w:ascii="Times New Roman" w:hAnsi="Times New Roman" w:cs="Times New Roman"/>
-          <w:sz w:val="24"/>
-          <w:szCs w:val="22"/>
-        </w:rPr>
-        <w:t>of this function in [edit_contact] and [delete_contact].</w:t>
-      </w:r>
-    </w:p>
-    <w:p>
-      <w:pPr>
-        <w:spacing w:line="276" w:lineRule="auto"/>
-        <w:rPr>
-          <w:rFonts w:ascii="Times New Roman" w:hAnsi="Times New Roman" w:cs="Times New Roman"/>
-          <w:sz w:val="24"/>
-          <w:szCs w:val="22"/>
-        </w:rPr>
-      </w:pPr>
-    </w:p>
-    <w:p>
-      <w:pPr>
-        <w:spacing w:line="276" w:lineRule="auto"/>
-        <w:rPr>
-          <w:rFonts w:ascii="Times New Roman" w:hAnsi="Times New Roman" w:cs="Times New Roman"/>
-          <w:sz w:val="24"/>
-          <w:szCs w:val="22"/>
-        </w:rPr>
-      </w:pPr>
-      <w:r>
-        <w:rPr>
-          <w:rFonts w:ascii="Times New Roman" w:hAnsi="Times New Roman" w:cs="Times New Roman"/>
-          <w:sz w:val="24"/>
-          <w:szCs w:val="22"/>
-        </w:rPr>
-        <w:t>All the matched contacts are displayed to the user on the console.</w:t>
-      </w:r>
-    </w:p>
-    <w:p>
-      <w:pPr>
-        <w:spacing w:line="276" w:lineRule="auto"/>
-        <w:rPr>
-          <w:rFonts w:ascii="Times New Roman" w:hAnsi="Times New Roman" w:cs="Times New Roman"/>
-          <w:sz w:val="24"/>
-          <w:szCs w:val="22"/>
-        </w:rPr>
-      </w:pPr>
-    </w:p>
-    <w:p>
-      <w:pPr>
-        <w:spacing w:line="276" w:lineRule="auto"/>
-        <w:rPr>
-          <w:rFonts w:ascii="Times New Roman" w:hAnsi="Times New Roman" w:cs="Times New Roman"/>
-          <w:sz w:val="24"/>
-          <w:szCs w:val="22"/>
-        </w:rPr>
-      </w:pPr>
-    </w:p>
-    <w:p>
-      <w:pPr>
-        <w:spacing w:line="276" w:lineRule="auto"/>
-        <w:rPr>
-          <w:rFonts w:ascii="Times New Roman" w:hAnsi="Times New Roman" w:cs="Times New Roman"/>
-          <w:sz w:val="24"/>
-          <w:szCs w:val="22"/>
-        </w:rPr>
-      </w:pPr>
-    </w:p>
-    <w:p>
-      <w:pPr>
-        <w:spacing w:line="276" w:lineRule="auto"/>
-        <w:rPr>
-          <w:rFonts w:ascii="Times New Roman" w:hAnsi="Times New Roman" w:cs="Times New Roman"/>
-          <w:sz w:val="24"/>
-          <w:szCs w:val="22"/>
-        </w:rPr>
-      </w:pPr>
-    </w:p>
-    <w:p>
-      <w:pPr>
-        <w:spacing w:line="276" w:lineRule="auto"/>
-        <w:rPr>
-          <w:rFonts w:ascii="Times New Roman" w:hAnsi="Times New Roman" w:cs="Times New Roman"/>
-          <w:sz w:val="24"/>
-          <w:szCs w:val="22"/>
-        </w:rPr>
-      </w:pPr>
-    </w:p>
-    <w:p>
-      <w:pPr>
-        <w:spacing w:line="276" w:lineRule="auto"/>
-        <w:rPr>
-          <w:rFonts w:ascii="Times New Roman" w:hAnsi="Times New Roman" w:cs="Times New Roman"/>
-          <w:sz w:val="24"/>
-          <w:szCs w:val="22"/>
-        </w:rPr>
-      </w:pPr>
-      <w:r>
-        <w:rPr>
-          <w:rFonts w:ascii="Times New Roman" w:hAnsi="Times New Roman" w:cs="Times New Roman"/>
-          <w:sz w:val="24"/>
-          <w:szCs w:val="22"/>
-        </w:rPr>
-        <w:t>3) edit_contact:</w:t>
-      </w:r>
-    </w:p>
-    <w:p>
-      <w:pPr>
-        <w:spacing w:line="276" w:lineRule="auto"/>
-        <w:rPr>
-          <w:rFonts w:ascii="Times New Roman" w:hAnsi="Times New Roman" w:cs="Times New Roman"/>
-          <w:sz w:val="24"/>
-          <w:szCs w:val="22"/>
-        </w:rPr>
-      </w:pPr>
-    </w:p>
-    <w:p>
-      <w:pPr>
-        <w:spacing w:line="276" w:lineRule="auto"/>
-        <w:ind w:firstLine="567"/>
-        <w:rPr>
-          <w:rFonts w:ascii="Times New Roman" w:hAnsi="Times New Roman" w:cs="Times New Roman"/>
-          <w:sz w:val="24"/>
-          <w:szCs w:val="22"/>
-        </w:rPr>
-      </w:pPr>
-      <w:r>
-        <w:rPr>
-          <w:rFonts w:ascii="Times New Roman" w:hAnsi="Times New Roman" w:cs="Times New Roman"/>
-          <w:sz w:val="24"/>
-          <w:szCs w:val="22"/>
-        </w:rPr>
-        <w:t>In edit contact we are using the [search_contact] function first, because before editing we</w:t>
-      </w:r>
-      <w:r>
-        <w:rPr>
-          <w:rFonts w:ascii="Times New Roman" w:hAnsi="Times New Roman" w:cs="Times New Roman"/>
-          <w:sz w:val="24"/>
-          <w:szCs w:val="22"/>
-        </w:rPr>
-        <w:t xml:space="preserve"> </w:t>
+        <w:t>the execution are saved permanently.</w:t>
+      </w:r>
+    </w:p>
+    <w:p>
+      <w:pPr>
+        <w:spacing w:line="276" w:lineRule="auto"/>
+        <w:rPr>
+          <w:rFonts w:ascii="Times New Roman" w:hAnsi="Times New Roman" w:cs="Times New Roman"/>
+          <w:sz w:val="24"/>
+          <w:szCs w:val="22"/>
+        </w:rPr>
+      </w:pPr>
+    </w:p>
+    <w:p>
+      <w:pPr>
+        <w:spacing w:line="276" w:lineRule="auto"/>
+        <w:rPr>
+          <w:rFonts w:ascii="Times New Roman" w:hAnsi="Times New Roman" w:cs="Times New Roman"/>
+          <w:sz w:val="24"/>
+          <w:szCs w:val="22"/>
+        </w:rPr>
+      </w:pPr>
+    </w:p>
+    <w:p>
+      <w:pPr>
+        <w:spacing w:line="276" w:lineRule="auto"/>
+        <w:rPr>
+          <w:rFonts w:ascii="Times New Roman" w:hAnsi="Times New Roman" w:cs="Times New Roman"/>
+          <w:sz w:val="24"/>
+          <w:szCs w:val="22"/>
+        </w:rPr>
+      </w:pPr>
+    </w:p>
+    <w:p>
+      <w:pPr>
+        <w:spacing w:line="276" w:lineRule="auto"/>
+        <w:rPr>
+          <w:rFonts w:ascii="Times New Roman" w:hAnsi="Times New Roman" w:cs="Times New Roman"/>
+          <w:sz w:val="24"/>
+          <w:szCs w:val="22"/>
+        </w:rPr>
+      </w:pPr>
+      <w:r>
+        <w:rPr>
+          <w:rFonts w:ascii="Times New Roman" w:hAnsi="Times New Roman" w:cs="Times New Roman"/>
+          <w:sz w:val="24"/>
+          <w:szCs w:val="22"/>
+        </w:rPr>
+        <w:t xml:space="preserve">Detailed explanation: </w:t>
+      </w:r>
+    </w:p>
+    <w:p>
+      <w:pPr>
+        <w:spacing w:line="276" w:lineRule="auto"/>
+        <w:rPr>
+          <w:rFonts w:ascii="Times New Roman" w:hAnsi="Times New Roman" w:cs="Times New Roman"/>
+          <w:sz w:val="24"/>
+          <w:szCs w:val="22"/>
+        </w:rPr>
+      </w:pPr>
+    </w:p>
+    <w:p>
+      <w:pPr>
+        <w:spacing w:line="276" w:lineRule="auto"/>
+        <w:rPr>
+          <w:rFonts w:ascii="Times New Roman" w:hAnsi="Times New Roman" w:cs="Times New Roman"/>
+          <w:sz w:val="24"/>
+          <w:szCs w:val="22"/>
+        </w:rPr>
+      </w:pPr>
+      <w:r>
+        <w:rPr>
+          <w:rFonts w:ascii="Times New Roman" w:hAnsi="Times New Roman" w:cs="Times New Roman"/>
+          <w:sz w:val="24"/>
+          <w:szCs w:val="22"/>
+        </w:rPr>
+        <w:tab/>
+        <w:t>While developing the project we have gone through the AddressBook.h file there we were having the structure and the functions to implement we have understood the project requirement and use of each function properly first before writing even a single line of code</w:t>
+      </w:r>
+      <w:r>
+        <w:rPr>
+          <w:rFonts w:ascii="Times New Roman" w:hAnsi="Times New Roman" w:cs="Times New Roman"/>
+          <w:sz w:val="24"/>
+          <w:szCs w:val="22"/>
+        </w:rPr>
+        <w:t>.</w:t>
+      </w:r>
+    </w:p>
+    <w:p>
+      <w:pPr>
+        <w:spacing w:line="276" w:lineRule="auto"/>
+        <w:rPr>
+          <w:rFonts w:ascii="Times New Roman" w:hAnsi="Times New Roman" w:cs="Times New Roman"/>
+          <w:sz w:val="24"/>
+          <w:szCs w:val="22"/>
+        </w:rPr>
+      </w:pPr>
+    </w:p>
+    <w:p>
+      <w:pPr>
+        <w:spacing w:line="276" w:lineRule="auto"/>
+        <w:rPr>
+          <w:rFonts w:ascii="Times New Roman" w:hAnsi="Times New Roman" w:cs="Times New Roman"/>
+          <w:sz w:val="24"/>
+          <w:szCs w:val="22"/>
+        </w:rPr>
+      </w:pPr>
+      <w:r>
+        <w:rPr>
+          <w:rFonts w:ascii="Times New Roman" w:hAnsi="Times New Roman" w:cs="Times New Roman"/>
+          <w:sz w:val="24"/>
+          <w:szCs w:val="22"/>
+        </w:rPr>
+        <w:tab/>
+        <w:t>All the information about the structure of projects and functions we used is added above this documentation now I will explain the use of each function what we used and what kind of errors and problems we faced.</w:t>
+      </w:r>
+    </w:p>
+    <w:p>
+      <w:pPr>
+        <w:spacing w:line="276" w:lineRule="auto"/>
+        <w:rPr>
+          <w:rFonts w:ascii="Times New Roman" w:hAnsi="Times New Roman" w:cs="Times New Roman"/>
+          <w:sz w:val="24"/>
+          <w:szCs w:val="22"/>
+        </w:rPr>
+      </w:pPr>
+      <w:r>
+        <w:rPr>
+          <w:rFonts w:ascii="Times New Roman" w:hAnsi="Times New Roman" w:cs="Times New Roman"/>
+          <w:sz w:val="24"/>
+          <w:szCs w:val="22"/>
+        </w:rPr>
+        <w:lastRenderedPageBreak/>
+        <w:tab/>
+      </w:r>
+      <w:r>
+        <w:rPr>
+          <w:rFonts w:ascii="Times New Roman" w:hAnsi="Times New Roman" w:cs="Times New Roman"/>
+          <w:sz w:val="24"/>
+          <w:szCs w:val="22"/>
+        </w:rPr>
+        <w:t>First,</w:t>
+      </w:r>
+      <w:r>
+        <w:rPr>
+          <w:rFonts w:ascii="Times New Roman" w:hAnsi="Times New Roman" w:cs="Times New Roman"/>
+          <w:sz w:val="24"/>
+          <w:szCs w:val="22"/>
+        </w:rPr>
+        <w:t xml:space="preserve"> I was not sure how to validate the user input and ask user </w:t>
+      </w:r>
+      <w:r>
+        <w:rPr>
+          <w:rFonts w:ascii="Times New Roman" w:hAnsi="Times New Roman" w:cs="Times New Roman"/>
+          <w:sz w:val="24"/>
+          <w:szCs w:val="22"/>
+        </w:rPr>
+        <w:t>again</w:t>
+      </w:r>
+      <w:r>
+        <w:rPr>
+          <w:rFonts w:ascii="Times New Roman" w:hAnsi="Times New Roman" w:cs="Times New Roman"/>
+          <w:sz w:val="24"/>
+          <w:szCs w:val="22"/>
+        </w:rPr>
+        <w:t xml:space="preserve"> until we get proper input from the user.</w:t>
+      </w:r>
+      <w:r>
+        <w:rPr>
+          <w:rFonts w:ascii="Times New Roman" w:hAnsi="Times New Roman" w:cs="Times New Roman"/>
+          <w:sz w:val="24"/>
+          <w:szCs w:val="22"/>
+        </w:rPr>
+        <w:t xml:space="preserve"> I decided to go with the while loop</w:t>
+      </w:r>
+      <w:r>
+        <w:rPr>
+          <w:rFonts w:ascii="Times New Roman" w:hAnsi="Times New Roman" w:cs="Times New Roman"/>
+          <w:sz w:val="24"/>
+          <w:szCs w:val="22"/>
+        </w:rPr>
+        <w:t>. After t</w:t>
+      </w:r>
+      <w:r>
+        <w:rPr>
+          <w:rFonts w:ascii="Times New Roman" w:hAnsi="Times New Roman" w:cs="Times New Roman"/>
+          <w:sz w:val="24"/>
+          <w:szCs w:val="22"/>
+        </w:rPr>
+        <w:t xml:space="preserve">hat I faced another problem which was of the \n character present int the buffer. </w:t>
+      </w:r>
+      <w:r>
+        <w:rPr>
+          <w:rFonts w:ascii="Times New Roman" w:hAnsi="Times New Roman" w:cs="Times New Roman"/>
+          <w:sz w:val="24"/>
+          <w:szCs w:val="22"/>
+        </w:rPr>
+        <w:t xml:space="preserve"> As we will be taking the name with the spaces, we should be using the selective scanf in the function</w:t>
+      </w:r>
+      <w:r>
+        <w:rPr>
+          <w:rFonts w:ascii="Times New Roman" w:hAnsi="Times New Roman" w:cs="Times New Roman"/>
+          <w:sz w:val="24"/>
+          <w:szCs w:val="22"/>
+        </w:rPr>
+        <w:t>.</w:t>
+      </w:r>
+    </w:p>
+    <w:p>
+      <w:pPr>
+        <w:spacing w:line="276" w:lineRule="auto"/>
+        <w:rPr>
+          <w:rFonts w:ascii="Times New Roman" w:hAnsi="Times New Roman" w:cs="Times New Roman"/>
+          <w:sz w:val="24"/>
+          <w:szCs w:val="22"/>
+        </w:rPr>
+      </w:pPr>
+    </w:p>
+    <w:p>
+      <w:pPr>
+        <w:spacing w:line="276" w:lineRule="auto"/>
+        <w:ind w:firstLine="1287"/>
+        <w:rPr>
+          <w:rFonts w:ascii="Times New Roman" w:hAnsi="Times New Roman" w:cs="Times New Roman"/>
+          <w:sz w:val="24"/>
+          <w:szCs w:val="22"/>
+        </w:rPr>
+      </w:pPr>
+      <w:r>
+        <w:rPr>
+          <w:rFonts w:ascii="Times New Roman" w:hAnsi="Times New Roman" w:cs="Times New Roman"/>
+          <w:sz w:val="24"/>
+          <w:szCs w:val="22"/>
+        </w:rPr>
+        <w:t>Problem with that is w</w:t>
+      </w:r>
+      <w:r>
+        <w:rPr>
+          <w:rFonts w:ascii="Times New Roman" w:hAnsi="Times New Roman" w:cs="Times New Roman"/>
+          <w:sz w:val="24"/>
+          <w:szCs w:val="22"/>
+        </w:rPr>
+        <w:t xml:space="preserve">hile I was trying to take the input from the user It was continuously skipping the name then I realised </w:t>
+      </w:r>
+      <w:r>
+        <w:rPr>
+          <w:rFonts w:ascii="Times New Roman" w:hAnsi="Times New Roman" w:cs="Times New Roman"/>
+          <w:sz w:val="24"/>
+          <w:szCs w:val="22"/>
+        </w:rPr>
+        <w:t>that was happening because of</w:t>
+      </w:r>
+      <w:r>
+        <w:rPr>
+          <w:rFonts w:ascii="Times New Roman" w:hAnsi="Times New Roman" w:cs="Times New Roman"/>
+          <w:sz w:val="24"/>
+          <w:szCs w:val="22"/>
+        </w:rPr>
+        <w:t xml:space="preserve"> \n character present in buffer when ever you take input </w:t>
+      </w:r>
+      <w:r>
+        <w:rPr>
+          <w:rFonts w:ascii="Times New Roman" w:hAnsi="Times New Roman" w:cs="Times New Roman"/>
+          <w:sz w:val="24"/>
+          <w:szCs w:val="22"/>
+        </w:rPr>
+        <w:t xml:space="preserve">with the %s it takes the input normally but the internal working of this is if there is \n character present then it will skip that and take input string from the user. </w:t>
+      </w:r>
+      <w:r>
+        <w:rPr>
+          <w:rFonts w:ascii="Times New Roman" w:hAnsi="Times New Roman" w:cs="Times New Roman"/>
+          <w:sz w:val="24"/>
+          <w:szCs w:val="22"/>
+        </w:rPr>
+        <w:t>But when you use the selective scanf %[^\n] then it will not skip that instead it will be consumed by it and</w:t>
+      </w:r>
+      <w:r>
+        <w:rPr>
+          <w:rFonts w:ascii="Times New Roman" w:hAnsi="Times New Roman" w:cs="Times New Roman"/>
+          <w:sz w:val="24"/>
+          <w:szCs w:val="22"/>
+        </w:rPr>
+        <w:t xml:space="preserve"> will not take the user input.</w:t>
+      </w:r>
+    </w:p>
+    <w:p>
+      <w:pPr>
+        <w:spacing w:line="276" w:lineRule="auto"/>
+        <w:rPr>
+          <w:rFonts w:ascii="Times New Roman" w:hAnsi="Times New Roman" w:cs="Times New Roman"/>
+          <w:sz w:val="24"/>
+          <w:szCs w:val="22"/>
+        </w:rPr>
+      </w:pPr>
+      <w:r>
+        <w:rPr>
+          <w:rFonts w:ascii="Times New Roman" w:hAnsi="Times New Roman" w:cs="Times New Roman"/>
+          <w:sz w:val="24"/>
+          <w:szCs w:val="22"/>
+        </w:rPr>
+        <w:drawing>
+          <wp:anchor distT="0" distB="0" distL="114300" distR="114300" simplePos="0" relativeHeight="251658240" behindDoc="1" locked="0" layoutInCell="1" allowOverlap="1" wp14:anchorId="1C9800D1" wp14:editId="64F29D3F">
+            <wp:simplePos x="0" y="0"/>
+            <wp:positionH relativeFrom="margin">
+              <wp:posOffset>-9525</wp:posOffset>
+            </wp:positionH>
+            <wp:positionV relativeFrom="paragraph">
+              <wp:posOffset>257810</wp:posOffset>
+            </wp:positionV>
+            <wp:extent cx="5731510" cy="3263265"/>
+            <wp:effectExtent l="0" t="0" r="2540" b="0"/>
+            <wp:wrapTight wrapText="bothSides">
+              <wp:wrapPolygon edited="0">
+                <wp:start x="0" y="0"/>
+                <wp:lineTo x="0" y="21436"/>
+                <wp:lineTo x="21538" y="21436"/>
+                <wp:lineTo x="21538" y="0"/>
+                <wp:lineTo x="0" y="0"/>
+              </wp:wrapPolygon>
+            </wp:wrapTight>
+            <wp:docPr id="2051853100" name="Picture 1"/>
+            <wp:cNvGraphicFramePr>
+              <a:graphicFrameLocks xmlns:a="http://schemas.openxmlformats.org/drawingml/2006/main" noChangeAspect="1"/>
+            </wp:cNvGraphicFramePr>
+            <a:graphic xmlns:a="http://schemas.openxmlformats.org/drawingml/2006/main">
+              <a:graphicData uri="http://schemas.openxmlformats.org/drawingml/2006/picture">
+                <pic:pic xmlns:pic="http://schemas.openxmlformats.org/drawingml/2006/picture">
+                  <pic:nvPicPr>
+                    <pic:cNvPr id="2051853100" name=""/>
+                    <pic:cNvPicPr/>
+                  </pic:nvPicPr>
+                  <pic:blipFill>
+                    <a:blip r:embed="rId4">
+                      <a:extLst>
+                        <a:ext uri="{28A0092B-C50C-407E-A947-70E740481C1C}">
+                          <a14:useLocalDpi xmlns:a14="http://schemas.microsoft.com/office/drawing/2010/main" val="0"/>
+                        </a:ext>
+                      </a:extLst>
+                    </a:blip>
+                    <a:stretch>
+                      <a:fillRect/>
+                    </a:stretch>
+                  </pic:blipFill>
+                  <pic:spPr>
+                    <a:xfrm>
+                      <a:off x="0" y="0"/>
+                      <a:ext cx="5731510" cy="3263265"/>
+                    </a:xfrm>
+                    <a:prstGeom prst="rect">
+                      <a:avLst/>
+                    </a:prstGeom>
+                  </pic:spPr>
+                </pic:pic>
+              </a:graphicData>
+            </a:graphic>
+          </wp:anchor>
+        </w:drawing>
+      </w:r>
+    </w:p>
+    <w:p>
+      <w:pPr>
+        <w:spacing w:line="276" w:lineRule="auto"/>
+        <w:rPr>
+          <w:rFonts w:ascii="Times New Roman" w:hAnsi="Times New Roman" w:cs="Times New Roman"/>
+          <w:sz w:val="24"/>
+          <w:szCs w:val="22"/>
+        </w:rPr>
+      </w:pPr>
+    </w:p>
+    <w:p>
+      <w:pPr>
+        <w:spacing w:line="276" w:lineRule="auto"/>
+        <w:rPr>
+          <w:rFonts w:ascii="Times New Roman" w:hAnsi="Times New Roman" w:cs="Times New Roman"/>
+          <w:sz w:val="24"/>
+          <w:szCs w:val="22"/>
+        </w:rPr>
+      </w:pPr>
+    </w:p>
+    <w:p>
+      <w:pPr>
+        <w:spacing w:line="276" w:lineRule="auto"/>
+        <w:rPr>
+          <w:rFonts w:ascii="Times New Roman" w:hAnsi="Times New Roman" w:cs="Times New Roman"/>
+          <w:sz w:val="24"/>
+          <w:szCs w:val="22"/>
+        </w:rPr>
+      </w:pPr>
+      <w:r>
+        <w:rPr>
+          <w:rFonts w:ascii="Times New Roman" w:hAnsi="Times New Roman" w:cs="Times New Roman"/>
+          <w:sz w:val="24"/>
+          <w:szCs w:val="22"/>
+        </w:rPr>
+        <w:tab/>
+        <w:t>Also another problem is if user entered string grater than the size allocated for it the %s will fail to withstand that that’s why I used limited selective input like this  %49[^\n] which will handle the input even if the input is out of range and to handle that \n character we taken space before accepting any input using the selective scanf like this  scanf(“_%49[^\n]”, ---);</w:t>
+      </w:r>
+    </w:p>
+    <w:p>
+      <w:pPr>
+        <w:spacing w:line="276" w:lineRule="auto"/>
+        <w:rPr>
+          <w:rFonts w:ascii="Times New Roman" w:hAnsi="Times New Roman" w:cs="Times New Roman"/>
+          <w:sz w:val="24"/>
+          <w:szCs w:val="22"/>
+        </w:rPr>
+      </w:pPr>
+    </w:p>
+    <w:p>
+      <w:pPr>
+        <w:spacing w:line="276" w:lineRule="auto"/>
+        <w:rPr>
+          <w:rFonts w:ascii="Times New Roman" w:hAnsi="Times New Roman" w:cs="Times New Roman"/>
+          <w:sz w:val="24"/>
+          <w:szCs w:val="22"/>
+        </w:rPr>
+      </w:pPr>
+    </w:p>
+    <w:p>
+      <w:pPr>
+        <w:spacing w:line="276" w:lineRule="auto"/>
+        <w:rPr>
+          <w:rFonts w:ascii="Times New Roman" w:hAnsi="Times New Roman" w:cs="Times New Roman"/>
+          <w:sz w:val="24"/>
+          <w:szCs w:val="22"/>
+        </w:rPr>
+      </w:pPr>
+    </w:p>
+    <w:p>
+      <w:pPr>
+        <w:spacing w:line="276" w:lineRule="auto"/>
+        <w:rPr>
+          <w:rFonts w:ascii="Times New Roman" w:hAnsi="Times New Roman" w:cs="Times New Roman"/>
+          <w:sz w:val="24"/>
+          <w:szCs w:val="22"/>
+        </w:rPr>
+      </w:pPr>
+    </w:p>
+    <w:p>
+      <w:pPr>
+        <w:spacing w:line="276" w:lineRule="auto"/>
+        <w:rPr>
+          <w:rFonts w:ascii="Times New Roman" w:hAnsi="Times New Roman" w:cs="Times New Roman"/>
+          <w:sz w:val="24"/>
+          <w:szCs w:val="22"/>
+        </w:rPr>
+      </w:pPr>
+    </w:p>
+    <w:p>
+      <w:pPr>
+        <w:spacing w:line="276" w:lineRule="auto"/>
+        <w:rPr>
+          <w:rFonts w:ascii="Times New Roman" w:hAnsi="Times New Roman" w:cs="Times New Roman"/>
+          <w:sz w:val="24"/>
+          <w:szCs w:val="22"/>
+        </w:rPr>
+      </w:pPr>
+    </w:p>
+    <w:p>
+      <w:pPr>
+        <w:spacing w:line="276" w:lineRule="auto"/>
+        <w:rPr>
+          <w:rFonts w:ascii="Times New Roman" w:hAnsi="Times New Roman" w:cs="Times New Roman"/>
+          <w:sz w:val="24"/>
+          <w:szCs w:val="22"/>
+        </w:rPr>
+      </w:pPr>
+    </w:p>
+    <w:p>
+      <w:pPr>
+        <w:spacing w:line="276" w:lineRule="auto"/>
+        <w:rPr>
+          <w:rFonts w:ascii="Times New Roman" w:hAnsi="Times New Roman" w:cs="Times New Roman"/>
+          <w:sz w:val="24"/>
+          <w:szCs w:val="22"/>
+        </w:rPr>
+      </w:pPr>
+    </w:p>
+    <w:p>
+      <w:pPr>
+        <w:spacing w:line="276" w:lineRule="auto"/>
+        <w:rPr>
+          <w:rFonts w:ascii="Times New Roman" w:hAnsi="Times New Roman" w:cs="Times New Roman"/>
+          <w:sz w:val="24"/>
+          <w:szCs w:val="22"/>
+        </w:rPr>
+      </w:pPr>
+    </w:p>
+    <w:p>
+      <w:pPr>
+        <w:spacing w:line="276" w:lineRule="auto"/>
+        <w:rPr>
+          <w:rFonts w:ascii="Times New Roman" w:hAnsi="Times New Roman" w:cs="Times New Roman"/>
+          <w:sz w:val="24"/>
+          <w:szCs w:val="22"/>
+        </w:rPr>
+      </w:pPr>
+      <w:r>
+        <w:rPr>
+          <w:rFonts w:ascii="Times New Roman" w:hAnsi="Times New Roman" w:cs="Times New Roman"/>
+          <w:sz w:val="24"/>
+          <w:szCs w:val="22"/>
+        </w:rPr>
+        <w:lastRenderedPageBreak/>
+        <w:tab/>
+        <w:t xml:space="preserve">Then I have gone through the rules of email and mobile for name it was simple that we </w:t>
       </w:r>
       <w:r>
         <w:rPr>
@@ -903,600 +1882,162 @@
           <w:sz w:val="24"/>
           <w:szCs w:val="22"/>
         </w:rPr>
-        <w:t xml:space="preserve"> locate the specific contact. After searching, if the contact exists then it will be shown.</w:t>
-      </w:r>
-      <w:r>
-        <w:rPr>
-          <w:rFonts w:ascii="Times New Roman" w:hAnsi="Times New Roman" w:cs="Times New Roman"/>
-          <w:sz w:val="24"/>
-          <w:szCs w:val="22"/>
-        </w:rPr>
-        <w:t xml:space="preserve"> If the contact with the given information is not present then it will show not found message onto the console. </w:t>
-      </w:r>
-      <w:r>
-        <w:rPr>
-          <w:rFonts w:ascii="Times New Roman" w:hAnsi="Times New Roman" w:cs="Times New Roman"/>
-          <w:sz w:val="24"/>
-          <w:szCs w:val="22"/>
-        </w:rPr>
-        <w:t>If multiple entries are found then</w:t>
-      </w:r>
-      <w:r>
-        <w:rPr>
-          <w:rFonts w:ascii="Times New Roman" w:hAnsi="Times New Roman" w:cs="Times New Roman"/>
-          <w:sz w:val="24"/>
-          <w:szCs w:val="22"/>
-        </w:rPr>
-        <w:t>,</w:t>
-      </w:r>
-      <w:r>
-        <w:rPr>
-          <w:rFonts w:ascii="Times New Roman" w:hAnsi="Times New Roman" w:cs="Times New Roman"/>
-          <w:sz w:val="24"/>
-          <w:szCs w:val="22"/>
-        </w:rPr>
-        <w:t xml:space="preserve"> index_record is used to select the correct contact using</w:t>
-      </w:r>
-      <w:r>
-        <w:rPr>
-          <w:rFonts w:ascii="Times New Roman" w:hAnsi="Times New Roman" w:cs="Times New Roman"/>
-          <w:sz w:val="24"/>
-          <w:szCs w:val="22"/>
-        </w:rPr>
-        <w:t xml:space="preserve"> </w:t>
-      </w:r>
-      <w:r>
-        <w:rPr>
-          <w:rFonts w:ascii="Times New Roman" w:hAnsi="Times New Roman" w:cs="Times New Roman"/>
-          <w:sz w:val="24"/>
-          <w:szCs w:val="22"/>
-        </w:rPr>
-        <w:t>user input. After that [inputName], [inputPhone] and [inputEmail] are used again to take new data</w:t>
-      </w:r>
-      <w:r>
-        <w:rPr>
-          <w:rFonts w:ascii="Times New Roman" w:hAnsi="Times New Roman" w:cs="Times New Roman"/>
-          <w:sz w:val="24"/>
-          <w:szCs w:val="22"/>
-        </w:rPr>
-        <w:t xml:space="preserve"> </w:t>
-      </w:r>
-      <w:r>
-        <w:rPr>
-          <w:rFonts w:ascii="Times New Roman" w:hAnsi="Times New Roman" w:cs="Times New Roman"/>
-          <w:sz w:val="24"/>
-          <w:szCs w:val="22"/>
-        </w:rPr>
-        <w:t>with proper validation.</w:t>
-      </w:r>
-    </w:p>
-    <w:p>
-      <w:pPr>
-        <w:spacing w:line="276" w:lineRule="auto"/>
-        <w:rPr>
-          <w:rFonts w:ascii="Times New Roman" w:hAnsi="Times New Roman" w:cs="Times New Roman"/>
-          <w:sz w:val="24"/>
-          <w:szCs w:val="22"/>
-        </w:rPr>
-      </w:pPr>
-    </w:p>
-    <w:p>
-      <w:pPr>
-        <w:spacing w:line="276" w:lineRule="auto"/>
-        <w:ind w:firstLine="567"/>
-        <w:rPr>
-          <w:rFonts w:ascii="Times New Roman" w:hAnsi="Times New Roman" w:cs="Times New Roman"/>
-          <w:sz w:val="24"/>
-          <w:szCs w:val="22"/>
-        </w:rPr>
-      </w:pPr>
-      <w:r>
-        <w:rPr>
-          <w:rFonts w:ascii="Times New Roman" w:hAnsi="Times New Roman" w:cs="Times New Roman"/>
-          <w:sz w:val="24"/>
-          <w:szCs w:val="22"/>
-        </w:rPr>
-        <w:t>While updating the contact we also check that the new phone number and email are duplicates</w:t>
-      </w:r>
-      <w:r>
-        <w:rPr>
-          <w:rFonts w:ascii="Times New Roman" w:hAnsi="Times New Roman" w:cs="Times New Roman"/>
-          <w:sz w:val="24"/>
-          <w:szCs w:val="22"/>
-        </w:rPr>
-        <w:t xml:space="preserve"> </w:t>
-      </w:r>
-      <w:r>
-        <w:rPr>
-          <w:rFonts w:ascii="Times New Roman" w:hAnsi="Times New Roman" w:cs="Times New Roman"/>
-          <w:sz w:val="24"/>
-          <w:szCs w:val="22"/>
-        </w:rPr>
-        <w:t xml:space="preserve">or not </w:t>
-      </w:r>
-      <w:r>
-        <w:rPr>
-          <w:rFonts w:ascii="Times New Roman" w:hAnsi="Times New Roman" w:cs="Times New Roman"/>
-          <w:sz w:val="24"/>
-          <w:szCs w:val="22"/>
-        </w:rPr>
-        <w:t xml:space="preserve">using [ </w:t>
-      </w:r>
-      <w:r>
-        <w:rPr>
-          <w:rFonts w:ascii="Times New Roman" w:hAnsi="Times New Roman" w:cs="Times New Roman"/>
-          <w:sz w:val="24"/>
-          <w:szCs w:val="22"/>
-        </w:rPr>
-        <w:t>searchForDuplicate</w:t>
-      </w:r>
-      <w:r>
-        <w:rPr>
-          <w:rFonts w:ascii="Times New Roman" w:hAnsi="Times New Roman" w:cs="Times New Roman"/>
-          <w:sz w:val="24"/>
-          <w:szCs w:val="22"/>
-        </w:rPr>
-        <w:t xml:space="preserve"> ] </w:t>
-      </w:r>
-      <w:r>
-        <w:rPr>
-          <w:rFonts w:ascii="Times New Roman" w:hAnsi="Times New Roman" w:cs="Times New Roman"/>
-          <w:sz w:val="24"/>
-          <w:szCs w:val="22"/>
-        </w:rPr>
-        <w:t>as we have to avoid the duplicate entry in database</w:t>
-      </w:r>
-      <w:r>
-        <w:rPr>
-          <w:rFonts w:ascii="Times New Roman" w:hAnsi="Times New Roman" w:cs="Times New Roman"/>
-          <w:sz w:val="24"/>
-          <w:szCs w:val="22"/>
-        </w:rPr>
-        <w:t xml:space="preserve"> (with respect to other contacts</w:t>
-      </w:r>
-      <w:r>
-        <w:rPr>
-          <w:rFonts w:ascii="Times New Roman" w:hAnsi="Times New Roman" w:cs="Times New Roman"/>
-          <w:sz w:val="24"/>
-          <w:szCs w:val="22"/>
-        </w:rPr>
-        <w:t xml:space="preserve"> and not including the current contact which is being edited</w:t>
-      </w:r>
-      <w:r>
-        <w:rPr>
-          <w:rFonts w:ascii="Times New Roman" w:hAnsi="Times New Roman" w:cs="Times New Roman"/>
-          <w:sz w:val="24"/>
-          <w:szCs w:val="22"/>
-        </w:rPr>
-        <w:t>). If everything is valid then the selected contact is updated.</w:t>
-      </w:r>
-    </w:p>
-    <w:p>
-      <w:pPr>
-        <w:spacing w:line="276" w:lineRule="auto"/>
-        <w:rPr>
-          <w:rFonts w:ascii="Times New Roman" w:hAnsi="Times New Roman" w:cs="Times New Roman"/>
-          <w:sz w:val="24"/>
-          <w:szCs w:val="22"/>
-        </w:rPr>
-      </w:pPr>
-    </w:p>
-    <w:p>
-      <w:pPr>
-        <w:spacing w:line="276" w:lineRule="auto"/>
-        <w:rPr>
-          <w:rFonts w:ascii="Times New Roman" w:hAnsi="Times New Roman" w:cs="Times New Roman"/>
-          <w:sz w:val="24"/>
-          <w:szCs w:val="22"/>
-        </w:rPr>
-      </w:pPr>
-      <w:r>
-        <w:rPr>
-          <w:rFonts w:ascii="Times New Roman" w:hAnsi="Times New Roman" w:cs="Times New Roman"/>
-          <w:sz w:val="24"/>
-          <w:szCs w:val="22"/>
-        </w:rPr>
-        <w:t>4) delete_contact:</w:t>
-      </w:r>
-    </w:p>
-    <w:p>
-      <w:pPr>
-        <w:spacing w:line="276" w:lineRule="auto"/>
-        <w:rPr>
-          <w:rFonts w:ascii="Times New Roman" w:hAnsi="Times New Roman" w:cs="Times New Roman"/>
-          <w:sz w:val="24"/>
-          <w:szCs w:val="22"/>
-        </w:rPr>
-      </w:pPr>
-    </w:p>
-    <w:p>
-      <w:pPr>
-        <w:spacing w:line="276" w:lineRule="auto"/>
-        <w:ind w:firstLine="567"/>
-        <w:rPr>
-          <w:rFonts w:ascii="Times New Roman" w:hAnsi="Times New Roman" w:cs="Times New Roman"/>
-          <w:sz w:val="24"/>
-          <w:szCs w:val="22"/>
-        </w:rPr>
-      </w:pPr>
-      <w:r>
-        <w:rPr>
-          <w:rFonts w:ascii="Times New Roman" w:hAnsi="Times New Roman" w:cs="Times New Roman"/>
-          <w:sz w:val="24"/>
-          <w:szCs w:val="22"/>
-        </w:rPr>
-        <w:t>In delete contact we are using the [search_contact] function to find the required contact.</w:t>
-      </w:r>
-      <w:r>
-        <w:rPr>
-          <w:rFonts w:ascii="Times New Roman" w:hAnsi="Times New Roman" w:cs="Times New Roman"/>
-          <w:sz w:val="24"/>
-          <w:szCs w:val="22"/>
-        </w:rPr>
-        <w:t xml:space="preserve"> </w:t>
-      </w:r>
-      <w:r>
-        <w:rPr>
-          <w:rFonts w:ascii="Times New Roman" w:hAnsi="Times New Roman" w:cs="Times New Roman"/>
-          <w:sz w:val="24"/>
-          <w:szCs w:val="22"/>
-        </w:rPr>
-        <w:t>If multiple entries are found then index_record helps to select the correct one.</w:t>
-      </w:r>
-      <w:r>
-        <w:rPr>
-          <w:rFonts w:ascii="Times New Roman" w:hAnsi="Times New Roman" w:cs="Times New Roman"/>
-          <w:sz w:val="24"/>
-          <w:szCs w:val="22"/>
-        </w:rPr>
-        <w:t xml:space="preserve"> </w:t>
-      </w:r>
-      <w:r>
-        <w:rPr>
-          <w:rFonts w:ascii="Times New Roman" w:hAnsi="Times New Roman" w:cs="Times New Roman"/>
-          <w:sz w:val="24"/>
-          <w:szCs w:val="22"/>
-        </w:rPr>
-        <w:t>After selecting the contact, it is deleted from the contacts array by shifting all the</w:t>
-      </w:r>
-      <w:r>
-        <w:rPr>
-          <w:rFonts w:ascii="Times New Roman" w:hAnsi="Times New Roman" w:cs="Times New Roman"/>
-          <w:sz w:val="24"/>
-          <w:szCs w:val="22"/>
-        </w:rPr>
-        <w:t xml:space="preserve"> </w:t>
-      </w:r>
-      <w:r>
-        <w:rPr>
-          <w:rFonts w:ascii="Times New Roman" w:hAnsi="Times New Roman" w:cs="Times New Roman"/>
-          <w:sz w:val="24"/>
-          <w:szCs w:val="22"/>
-        </w:rPr>
-        <w:t>elements one position to the left. Then contactCount is decremented.</w:t>
-      </w:r>
-      <w:r>
-        <w:rPr>
-          <w:rFonts w:ascii="Times New Roman" w:hAnsi="Times New Roman" w:cs="Times New Roman"/>
-          <w:sz w:val="24"/>
-          <w:szCs w:val="22"/>
-        </w:rPr>
-        <w:t xml:space="preserve"> </w:t>
-      </w:r>
-      <w:r>
-        <w:rPr>
-          <w:rFonts w:ascii="Times New Roman" w:hAnsi="Times New Roman" w:cs="Times New Roman"/>
-          <w:sz w:val="24"/>
-          <w:szCs w:val="22"/>
-        </w:rPr>
-        <w:t>Finally, the updated data will be saved to the database while exiting the program using</w:t>
-      </w:r>
-      <w:r>
-        <w:rPr>
-          <w:rFonts w:ascii="Times New Roman" w:hAnsi="Times New Roman" w:cs="Times New Roman"/>
-          <w:sz w:val="24"/>
-          <w:szCs w:val="22"/>
-        </w:rPr>
-        <w:t xml:space="preserve"> </w:t>
-      </w:r>
-      <w:r>
-        <w:rPr>
-          <w:rFonts w:ascii="Times New Roman" w:hAnsi="Times New Roman" w:cs="Times New Roman"/>
-          <w:sz w:val="24"/>
-          <w:szCs w:val="22"/>
-        </w:rPr>
-        <w:t>[saveAllContactsToDataBase].</w:t>
-      </w:r>
-    </w:p>
-    <w:p>
-      <w:pPr>
-        <w:spacing w:line="276" w:lineRule="auto"/>
-        <w:rPr>
-          <w:rFonts w:ascii="Times New Roman" w:hAnsi="Times New Roman" w:cs="Times New Roman"/>
-          <w:sz w:val="24"/>
-          <w:szCs w:val="22"/>
-        </w:rPr>
-      </w:pPr>
-    </w:p>
-    <w:p>
-      <w:pPr>
-        <w:spacing w:line="276" w:lineRule="auto"/>
-        <w:rPr>
-          <w:rFonts w:ascii="Times New Roman" w:hAnsi="Times New Roman" w:cs="Times New Roman"/>
-          <w:sz w:val="24"/>
-          <w:szCs w:val="22"/>
-        </w:rPr>
-      </w:pPr>
-      <w:r>
-        <w:rPr>
-          <w:rFonts w:ascii="Times New Roman" w:hAnsi="Times New Roman" w:cs="Times New Roman"/>
-          <w:sz w:val="24"/>
-          <w:szCs w:val="22"/>
-        </w:rPr>
-        <w:t>5) list_contacts:</w:t>
-      </w:r>
-    </w:p>
-    <w:p>
-      <w:pPr>
-        <w:spacing w:line="276" w:lineRule="auto"/>
-        <w:rPr>
-          <w:rFonts w:ascii="Times New Roman" w:hAnsi="Times New Roman" w:cs="Times New Roman"/>
-          <w:sz w:val="24"/>
-          <w:szCs w:val="22"/>
-        </w:rPr>
-      </w:pPr>
-    </w:p>
-    <w:p>
-      <w:pPr>
-        <w:spacing w:line="276" w:lineRule="auto"/>
-        <w:ind w:firstLine="567"/>
-        <w:rPr>
-          <w:rFonts w:ascii="Times New Roman" w:hAnsi="Times New Roman" w:cs="Times New Roman"/>
-          <w:sz w:val="24"/>
-          <w:szCs w:val="22"/>
-        </w:rPr>
-      </w:pPr>
-      <w:r>
-        <w:rPr>
-          <w:rFonts w:ascii="Times New Roman" w:hAnsi="Times New Roman" w:cs="Times New Roman"/>
-          <w:sz w:val="24"/>
-          <w:szCs w:val="22"/>
-        </w:rPr>
-        <w:t xml:space="preserve">In this function we are printing all the contacts present in the </w:t>
-      </w:r>
-      <w:r>
-        <w:rPr>
-          <w:rFonts w:ascii="Times New Roman" w:hAnsi="Times New Roman" w:cs="Times New Roman"/>
-          <w:sz w:val="24"/>
-          <w:szCs w:val="22"/>
-        </w:rPr>
-        <w:t>contacts</w:t>
-      </w:r>
-      <w:r>
-        <w:rPr>
-          <w:rFonts w:ascii="Times New Roman" w:hAnsi="Times New Roman" w:cs="Times New Roman"/>
-          <w:sz w:val="24"/>
-          <w:szCs w:val="22"/>
-        </w:rPr>
-        <w:t xml:space="preserve"> array.</w:t>
-      </w:r>
-      <w:r>
-        <w:rPr>
-          <w:rFonts w:ascii="Times New Roman" w:hAnsi="Times New Roman" w:cs="Times New Roman"/>
-          <w:sz w:val="24"/>
-          <w:szCs w:val="22"/>
-        </w:rPr>
-        <w:t xml:space="preserve"> </w:t>
-      </w:r>
-      <w:r>
-        <w:rPr>
-          <w:rFonts w:ascii="Times New Roman" w:hAnsi="Times New Roman" w:cs="Times New Roman"/>
-          <w:sz w:val="24"/>
-          <w:szCs w:val="22"/>
-        </w:rPr>
-        <w:t>We iterate from 0 to addressBook-&gt;contactCount and print all the details onto the console</w:t>
-      </w:r>
-      <w:r>
-        <w:rPr>
-          <w:rFonts w:ascii="Times New Roman" w:hAnsi="Times New Roman" w:cs="Times New Roman"/>
-          <w:sz w:val="24"/>
-          <w:szCs w:val="22"/>
-        </w:rPr>
-        <w:t xml:space="preserve"> </w:t>
-      </w:r>
-      <w:r>
-        <w:rPr>
-          <w:rFonts w:ascii="Times New Roman" w:hAnsi="Times New Roman" w:cs="Times New Roman"/>
-          <w:sz w:val="24"/>
-          <w:szCs w:val="22"/>
-        </w:rPr>
-        <w:t>in a formatted manner.</w:t>
-      </w:r>
-    </w:p>
-    <w:p>
-      <w:pPr>
-        <w:spacing w:line="276" w:lineRule="auto"/>
-        <w:rPr>
-          <w:rFonts w:ascii="Times New Roman" w:hAnsi="Times New Roman" w:cs="Times New Roman"/>
-          <w:sz w:val="24"/>
-          <w:szCs w:val="22"/>
-        </w:rPr>
-      </w:pPr>
-    </w:p>
-    <w:p>
-      <w:pPr>
-        <w:spacing w:line="276" w:lineRule="auto"/>
-        <w:rPr>
-          <w:rFonts w:ascii="Times New Roman" w:hAnsi="Times New Roman" w:cs="Times New Roman"/>
-          <w:sz w:val="24"/>
-          <w:szCs w:val="22"/>
-        </w:rPr>
-      </w:pPr>
-      <w:r>
-        <w:rPr>
-          <w:rFonts w:ascii="Times New Roman" w:hAnsi="Times New Roman" w:cs="Times New Roman"/>
-          <w:sz w:val="24"/>
-          <w:szCs w:val="22"/>
-        </w:rPr>
-        <w:t>6) Exit:</w:t>
-      </w:r>
-    </w:p>
-    <w:p>
-      <w:pPr>
-        <w:spacing w:line="276" w:lineRule="auto"/>
-        <w:rPr>
-          <w:rFonts w:ascii="Times New Roman" w:hAnsi="Times New Roman" w:cs="Times New Roman"/>
-          <w:sz w:val="24"/>
-          <w:szCs w:val="22"/>
-        </w:rPr>
-      </w:pPr>
-    </w:p>
-    <w:p>
-      <w:pPr>
-        <w:spacing w:line="276" w:lineRule="auto"/>
-        <w:ind w:firstLine="567"/>
-        <w:rPr>
-          <w:rFonts w:ascii="Times New Roman" w:hAnsi="Times New Roman" w:cs="Times New Roman"/>
-          <w:sz w:val="24"/>
-          <w:szCs w:val="22"/>
-        </w:rPr>
-      </w:pPr>
-      <w:r>
-        <w:rPr>
-          <w:rFonts w:ascii="Times New Roman" w:hAnsi="Times New Roman" w:cs="Times New Roman"/>
-          <w:sz w:val="24"/>
-          <w:szCs w:val="22"/>
-        </w:rPr>
-        <w:t>While exiting the program we are storing all the data present in the contacts array back</w:t>
-      </w:r>
-      <w:r>
-        <w:rPr>
-          <w:rFonts w:ascii="Times New Roman" w:hAnsi="Times New Roman" w:cs="Times New Roman"/>
-          <w:sz w:val="24"/>
-          <w:szCs w:val="22"/>
-        </w:rPr>
-        <w:t xml:space="preserve"> </w:t>
-      </w:r>
-      <w:r>
-        <w:rPr>
-          <w:rFonts w:ascii="Times New Roman" w:hAnsi="Times New Roman" w:cs="Times New Roman"/>
-          <w:sz w:val="24"/>
-          <w:szCs w:val="22"/>
-        </w:rPr>
-        <w:t>into the database using [saveAllContactsToDataBase]. This ensures that all changes made during</w:t>
-      </w:r>
-      <w:r>
-        <w:rPr>
-          <w:rFonts w:ascii="Times New Roman" w:hAnsi="Times New Roman" w:cs="Times New Roman"/>
-          <w:sz w:val="24"/>
-          <w:szCs w:val="22"/>
-        </w:rPr>
-        <w:t xml:space="preserve"> </w:t>
-      </w:r>
-      <w:r>
-        <w:rPr>
-          <w:rFonts w:ascii="Times New Roman" w:hAnsi="Times New Roman" w:cs="Times New Roman"/>
-          <w:sz w:val="24"/>
-          <w:szCs w:val="22"/>
-        </w:rPr>
-        <w:t>the execution are saved permanently.</w:t>
-      </w:r>
-    </w:p>
-    <w:p>
-      <w:pPr>
-        <w:spacing w:line="276" w:lineRule="auto"/>
-        <w:rPr>
-          <w:rFonts w:ascii="Times New Roman" w:hAnsi="Times New Roman" w:cs="Times New Roman"/>
-          <w:sz w:val="24"/>
-          <w:szCs w:val="22"/>
-        </w:rPr>
-      </w:pPr>
-    </w:p>
-    <w:p>
-      <w:pPr>
-        <w:spacing w:line="276" w:lineRule="auto"/>
-        <w:rPr>
-          <w:rFonts w:ascii="Times New Roman" w:hAnsi="Times New Roman" w:cs="Times New Roman"/>
-          <w:sz w:val="24"/>
-          <w:szCs w:val="22"/>
-        </w:rPr>
-      </w:pPr>
-    </w:p>
-    <w:p>
-      <w:pPr>
-        <w:spacing w:line="276" w:lineRule="auto"/>
-        <w:rPr>
-          <w:rFonts w:ascii="Times New Roman" w:hAnsi="Times New Roman" w:cs="Times New Roman"/>
-          <w:sz w:val="24"/>
-          <w:szCs w:val="22"/>
-        </w:rPr>
-      </w:pPr>
-    </w:p>
-    <w:p>
-      <w:pPr>
-        <w:spacing w:line="276" w:lineRule="auto"/>
-        <w:rPr>
-          <w:rFonts w:ascii="Times New Roman" w:hAnsi="Times New Roman" w:cs="Times New Roman"/>
-          <w:sz w:val="24"/>
-          <w:szCs w:val="22"/>
-        </w:rPr>
-      </w:pPr>
-      <w:r>
-        <w:rPr>
-          <w:rFonts w:ascii="Times New Roman" w:hAnsi="Times New Roman" w:cs="Times New Roman"/>
-          <w:sz w:val="24"/>
-          <w:szCs w:val="22"/>
-        </w:rPr>
-        <w:t xml:space="preserve">Detailed explanation: </w:t>
-      </w:r>
-    </w:p>
-    <w:p>
-      <w:pPr>
-        <w:spacing w:line="276" w:lineRule="auto"/>
-        <w:rPr>
-          <w:rFonts w:ascii="Times New Roman" w:hAnsi="Times New Roman" w:cs="Times New Roman"/>
-          <w:sz w:val="24"/>
-          <w:szCs w:val="22"/>
-        </w:rPr>
-      </w:pPr>
-      <w:r>
-        <w:rPr>
-          <w:rFonts w:ascii="Times New Roman" w:hAnsi="Times New Roman" w:cs="Times New Roman"/>
-          <w:sz w:val="24"/>
-          <w:szCs w:val="22"/>
-        </w:rPr>
-        <w:tab/>
-        <w:t>While developing the project we have gone through the AddressBook.h file there we were having the structure and the functions to implement we have understood the project requirement and use of each function properly first before writing even a single line of code.</w:t>
-      </w:r>
-    </w:p>
-    <w:p>
-      <w:pPr>
-        <w:spacing w:line="276" w:lineRule="auto"/>
-        <w:rPr>
-          <w:rFonts w:ascii="Times New Roman" w:hAnsi="Times New Roman" w:cs="Times New Roman"/>
-          <w:sz w:val="24"/>
-          <w:szCs w:val="22"/>
-        </w:rPr>
-      </w:pPr>
-    </w:p>
-    <w:p>
-      <w:pPr>
-        <w:spacing w:line="276" w:lineRule="auto"/>
-        <w:rPr>
-          <w:rFonts w:ascii="Times New Roman" w:hAnsi="Times New Roman" w:cs="Times New Roman"/>
-          <w:sz w:val="24"/>
-          <w:szCs w:val="22"/>
-        </w:rPr>
-      </w:pPr>
-      <w:r>
-        <w:rPr>
-          <w:rFonts w:ascii="Times New Roman" w:hAnsi="Times New Roman" w:cs="Times New Roman"/>
-          <w:sz w:val="24"/>
-          <w:szCs w:val="22"/>
-        </w:rPr>
-        <w:tab/>
-        <w:t xml:space="preserve">The use of the contacts array </w:t>
-      </w:r>
+        <w:t xml:space="preserve"> avoid other symbols and only accept A-Z, a-z, [space], [ - ], [ _ ], [.]</w:t>
+      </w:r>
+      <w:r>
+        <w:rPr>
+          <w:rFonts w:ascii="Times New Roman" w:hAnsi="Times New Roman" w:cs="Times New Roman"/>
+          <w:sz w:val="24"/>
+          <w:szCs w:val="22"/>
+        </w:rPr>
+        <w:t xml:space="preserve">. for mobile also it was simple that only 10 numbers are allowed. For email I have gone through the </w:t>
+      </w:r>
+      <w:r>
+        <w:rPr>
+          <w:rFonts w:ascii="Times New Roman" w:hAnsi="Times New Roman" w:cs="Times New Roman"/>
+          <w:sz w:val="24"/>
+          <w:szCs w:val="22"/>
+        </w:rPr>
+        <w:t>Wikipedia</w:t>
+      </w:r>
+      <w:r>
+        <w:rPr>
+          <w:rFonts w:ascii="Times New Roman" w:hAnsi="Times New Roman" w:cs="Times New Roman"/>
+          <w:sz w:val="24"/>
+          <w:szCs w:val="22"/>
+        </w:rPr>
+        <w:t>.</w:t>
+      </w:r>
+    </w:p>
+    <w:p>
+      <w:pPr>
+        <w:spacing w:line="276" w:lineRule="auto"/>
+        <w:rPr>
+          <w:rFonts w:ascii="Times New Roman" w:hAnsi="Times New Roman" w:cs="Times New Roman"/>
+          <w:sz w:val="24"/>
+          <w:szCs w:val="22"/>
+        </w:rPr>
+      </w:pPr>
+      <w:r>
+        <w:rPr>
+          <w:rFonts w:ascii="Times New Roman" w:hAnsi="Times New Roman" w:cs="Times New Roman"/>
+          <w:sz w:val="24"/>
+          <w:szCs w:val="22"/>
+        </w:rPr>
+        <w:drawing>
+          <wp:anchor distT="0" distB="0" distL="114300" distR="114300" simplePos="0" relativeHeight="251659264" behindDoc="1" locked="0" layoutInCell="1" allowOverlap="1" wp14:anchorId="0553AAC0" wp14:editId="2AA7BA80">
+            <wp:simplePos x="0" y="0"/>
+            <wp:positionH relativeFrom="margin">
+              <wp:align>center</wp:align>
+            </wp:positionH>
+            <wp:positionV relativeFrom="paragraph">
+              <wp:posOffset>192161</wp:posOffset>
+            </wp:positionV>
+            <wp:extent cx="6030595" cy="3909060"/>
+            <wp:effectExtent l="0" t="0" r="8255" b="0"/>
+            <wp:wrapTight wrapText="bothSides">
+              <wp:wrapPolygon edited="0">
+                <wp:start x="0" y="0"/>
+                <wp:lineTo x="0" y="21474"/>
+                <wp:lineTo x="21561" y="21474"/>
+                <wp:lineTo x="21561" y="0"/>
+                <wp:lineTo x="0" y="0"/>
+              </wp:wrapPolygon>
+            </wp:wrapTight>
+            <wp:docPr id="1730587085" name="Picture 1"/>
+            <wp:cNvGraphicFramePr>
+              <a:graphicFrameLocks xmlns:a="http://schemas.openxmlformats.org/drawingml/2006/main" noChangeAspect="1"/>
+            </wp:cNvGraphicFramePr>
+            <a:graphic xmlns:a="http://schemas.openxmlformats.org/drawingml/2006/main">
+              <a:graphicData uri="http://schemas.openxmlformats.org/drawingml/2006/picture">
+                <pic:pic xmlns:pic="http://schemas.openxmlformats.org/drawingml/2006/picture">
+                  <pic:nvPicPr>
+                    <pic:cNvPr id="1730587085" name=""/>
+                    <pic:cNvPicPr/>
+                  </pic:nvPicPr>
+                  <pic:blipFill>
+                    <a:blip r:embed="rId5" cstate="print">
+                      <a:extLst>
+                        <a:ext uri="{28A0092B-C50C-407E-A947-70E740481C1C}">
+                          <a14:useLocalDpi xmlns:a14="http://schemas.microsoft.com/office/drawing/2010/main" val="0"/>
+                        </a:ext>
+                      </a:extLst>
+                    </a:blip>
+                    <a:stretch>
+                      <a:fillRect/>
+                    </a:stretch>
+                  </pic:blipFill>
+                  <pic:spPr>
+                    <a:xfrm>
+                      <a:off x="0" y="0"/>
+                      <a:ext cx="6030595" cy="3909060"/>
+                    </a:xfrm>
+                    <a:prstGeom prst="rect">
+                      <a:avLst/>
+                    </a:prstGeom>
+                  </pic:spPr>
+                </pic:pic>
+              </a:graphicData>
+            </a:graphic>
+            <wp14:sizeRelH relativeFrom="margin">
+              <wp14:pctWidth>0</wp14:pctWidth>
+            </wp14:sizeRelH>
+            <wp14:sizeRelV relativeFrom="margin">
+              <wp14:pctHeight>0</wp14:pctHeight>
+            </wp14:sizeRelV>
+          </wp:anchor>
+        </w:drawing>
+      </w:r>
+    </w:p>
+    <w:p>
+      <w:pPr>
+        <w:spacing w:line="276" w:lineRule="auto"/>
+        <w:rPr>
+          <w:rFonts w:ascii="Times New Roman" w:hAnsi="Times New Roman" w:cs="Times New Roman"/>
+          <w:sz w:val="24"/>
+          <w:szCs w:val="22"/>
+        </w:rPr>
+      </w:pPr>
+    </w:p>
+    <w:p>
+      <w:pPr>
+        <w:spacing w:line="276" w:lineRule="auto"/>
+        <w:rPr>
+          <w:rFonts w:ascii="Times New Roman" w:hAnsi="Times New Roman" w:cs="Times New Roman"/>
+          <w:sz w:val="24"/>
+          <w:szCs w:val="22"/>
+        </w:rPr>
+      </w:pPr>
+    </w:p>
+    <w:p>
+      <w:pPr>
+        <w:spacing w:line="276" w:lineRule="auto"/>
+        <w:rPr>
+          <w:rFonts w:ascii="Times New Roman" w:hAnsi="Times New Roman" w:cs="Times New Roman"/>
+          <w:sz w:val="24"/>
+          <w:szCs w:val="22"/>
+        </w:rPr>
+      </w:pPr>
+    </w:p>
+    <w:p>
+      <w:pPr>
+        <w:spacing w:line="276" w:lineRule="auto"/>
+        <w:rPr>
+          <w:rFonts w:ascii="Times New Roman" w:hAnsi="Times New Roman" w:cs="Times New Roman"/>
+          <w:sz w:val="24"/>
+          <w:szCs w:val="22"/>
+        </w:rPr>
+      </w:pPr>
+    </w:p>
+    <w:p>
+      <w:pPr>
+        <w:spacing w:line="276" w:lineRule="auto"/>
+        <w:rPr>
+          <w:rFonts w:ascii="Times New Roman" w:hAnsi="Times New Roman" w:cs="Times New Roman"/>
+          <w:sz w:val="24"/>
+          <w:szCs w:val="22"/>
+        </w:rPr>
+      </w:pPr>
     </w:p>
     <w:sectPr>
       <w:pgSz w:w="11906" w:h="16838" w:code="9"/>
@@ -2113,6 +2654,7 @@
   <w:style w:type="character" w:default="1" w:styleId="DefaultParagraphFont">
     <w:name w:val="Default Paragraph Font"/>
     <w:uiPriority w:val="1"/>
+    <w:semiHidden/>
     <w:unhideWhenUsed/>
   </w:style>
   <w:style w:type="table" w:default="1" w:styleId="TableNormal">

</xml_diff>